<commit_message>
Carpeta con archivo TXT que contiene el link del video
</commit_message>
<xml_diff>
--- a/Tarea_2/Taller_1_base_de_datos.docx
+++ b/Tarea_2/Taller_1_base_de_datos.docx
@@ -164,27 +164,7 @@
           <w:szCs w:val="24"/>
           <w:lang w:val="es-ES"/>
         </w:rPr>
-        <w:t xml:space="preserve">Definición y elementos de Bases de Datos. Tipos de BD </w:t>
-      </w:r>
-      <w:proofErr w:type="gramStart"/>
-      <w:r>
-        <w:rPr>
-          <w:b/>
-          <w:sz w:val="24"/>
-          <w:szCs w:val="24"/>
-          <w:lang w:val="es-ES"/>
-        </w:rPr>
-        <w:t>y  Modelo</w:t>
-      </w:r>
-      <w:proofErr w:type="gramEnd"/>
-      <w:r>
-        <w:rPr>
-          <w:b/>
-          <w:sz w:val="24"/>
-          <w:szCs w:val="24"/>
-          <w:lang w:val="es-ES"/>
-        </w:rPr>
-        <w:t xml:space="preserve"> Conceptual (E-R)</w:t>
+        <w:t>Definición y elementos de Bases de Datos. Tipos de BD y  Modelo Conceptual (E-R)</w:t>
       </w:r>
     </w:p>
     <w:p>
@@ -408,39 +388,7 @@
           <w:color w:val="000000" w:themeColor="text1"/>
           <w:lang w:val="es-ES"/>
         </w:rPr>
-        <w:t xml:space="preserve">Modelo Entidad-Relación de </w:t>
-      </w:r>
-      <w:proofErr w:type="spellStart"/>
-      <w:r>
-        <w:rPr>
-          <w:color w:val="000000" w:themeColor="text1"/>
-          <w:lang w:val="es-ES"/>
-        </w:rPr>
-        <w:t>Crow's</w:t>
-      </w:r>
-      <w:proofErr w:type="spellEnd"/>
-      <w:r>
-        <w:rPr>
-          <w:color w:val="000000" w:themeColor="text1"/>
-          <w:lang w:val="es-ES"/>
-        </w:rPr>
-        <w:t xml:space="preserve"> </w:t>
-      </w:r>
-      <w:proofErr w:type="spellStart"/>
-      <w:r>
-        <w:rPr>
-          <w:color w:val="000000" w:themeColor="text1"/>
-          <w:lang w:val="es-ES"/>
-        </w:rPr>
-        <w:t>Foot</w:t>
-      </w:r>
-      <w:proofErr w:type="spellEnd"/>
-      <w:r>
-        <w:rPr>
-          <w:color w:val="000000" w:themeColor="text1"/>
-          <w:lang w:val="es-ES"/>
-        </w:rPr>
-        <w:t xml:space="preserve"> (Pata de Cuervo)</w:t>
+        <w:t>Modelo Entidad-Relación de Crow's Foot (Pata de Cuervo)</w:t>
       </w:r>
     </w:p>
     <w:p>
@@ -463,21 +411,12 @@
           <w:lang w:val="en-US"/>
         </w:rPr>
       </w:pPr>
-      <w:proofErr w:type="spellStart"/>
       <w:r>
         <w:rPr>
           <w:color w:val="000000"/>
           <w:lang w:val="en-US"/>
         </w:rPr>
-        <w:t>Modelo</w:t>
-      </w:r>
-      <w:proofErr w:type="spellEnd"/>
-      <w:r>
-        <w:rPr>
-          <w:color w:val="000000"/>
-          <w:lang w:val="en-US"/>
-        </w:rPr>
-        <w:t xml:space="preserve"> UML (Unified Modeling Language)</w:t>
+        <w:t>Modelo UML (Unified Modeling Language)</w:t>
       </w:r>
     </w:p>
     <w:p>
@@ -531,71 +470,7 @@
           <w:color w:val="000000" w:themeColor="text1"/>
           <w:lang w:val="es-ES"/>
         </w:rPr>
-        <w:t>Modelo de IDEF1X (</w:t>
-      </w:r>
-      <w:proofErr w:type="spellStart"/>
-      <w:r>
-        <w:rPr>
-          <w:color w:val="000000" w:themeColor="text1"/>
-          <w:lang w:val="es-ES"/>
-        </w:rPr>
-        <w:t>Integration</w:t>
-      </w:r>
-      <w:proofErr w:type="spellEnd"/>
-      <w:r>
-        <w:rPr>
-          <w:color w:val="000000" w:themeColor="text1"/>
-          <w:lang w:val="es-ES"/>
-        </w:rPr>
-        <w:t xml:space="preserve"> </w:t>
-      </w:r>
-      <w:proofErr w:type="spellStart"/>
-      <w:r>
-        <w:rPr>
-          <w:color w:val="000000" w:themeColor="text1"/>
-          <w:lang w:val="es-ES"/>
-        </w:rPr>
-        <w:t>Definition</w:t>
-      </w:r>
-      <w:proofErr w:type="spellEnd"/>
-      <w:r>
-        <w:rPr>
-          <w:color w:val="000000" w:themeColor="text1"/>
-          <w:lang w:val="es-ES"/>
-        </w:rPr>
-        <w:t xml:space="preserve"> for </w:t>
-      </w:r>
-      <w:proofErr w:type="spellStart"/>
-      <w:r>
-        <w:rPr>
-          <w:color w:val="000000" w:themeColor="text1"/>
-          <w:lang w:val="es-ES"/>
-        </w:rPr>
-        <w:t>Information</w:t>
-      </w:r>
-      <w:proofErr w:type="spellEnd"/>
-      <w:r>
-        <w:rPr>
-          <w:color w:val="000000" w:themeColor="text1"/>
-          <w:lang w:val="es-ES"/>
-        </w:rPr>
-        <w:t xml:space="preserve"> </w:t>
-      </w:r>
-      <w:proofErr w:type="spellStart"/>
-      <w:r>
-        <w:rPr>
-          <w:color w:val="000000" w:themeColor="text1"/>
-          <w:lang w:val="es-ES"/>
-        </w:rPr>
-        <w:t>Modeling</w:t>
-      </w:r>
-      <w:proofErr w:type="spellEnd"/>
-      <w:r>
-        <w:rPr>
-          <w:color w:val="000000" w:themeColor="text1"/>
-          <w:lang w:val="es-ES"/>
-        </w:rPr>
-        <w:t>)</w:t>
+        <w:t>Modelo de IDEF1X (Integration Definition for Information Modeling)</w:t>
       </w:r>
     </w:p>
     <w:p>
@@ -694,27 +569,7 @@
           <w:szCs w:val="24"/>
           <w:lang w:val="es-ES"/>
         </w:rPr>
-        <w:t xml:space="preserve">Diseñar una base de datos </w:t>
-      </w:r>
-      <w:proofErr w:type="gramStart"/>
-      <w:r>
-        <w:rPr>
-          <w:color w:val="000000" w:themeColor="text1"/>
-          <w:sz w:val="24"/>
-          <w:szCs w:val="24"/>
-          <w:lang w:val="es-ES"/>
-        </w:rPr>
-        <w:t>de acuerdo al</w:t>
-      </w:r>
-      <w:proofErr w:type="gramEnd"/>
-      <w:r>
-        <w:rPr>
-          <w:color w:val="000000" w:themeColor="text1"/>
-          <w:sz w:val="24"/>
-          <w:szCs w:val="24"/>
-          <w:lang w:val="es-ES"/>
-        </w:rPr>
-        <w:t xml:space="preserve"> Modelo Entidad Relación (Modelo E-R). </w:t>
+        <w:t xml:space="preserve">Diseñar una base de datos de acuerdo al Modelo Entidad Relación (Modelo E-R). </w:t>
       </w:r>
     </w:p>
     <w:p>
@@ -1065,49 +920,7 @@
         <w:rPr>
           <w:lang w:val="es-ES"/>
         </w:rPr>
-        <w:t xml:space="preserve">Colocar la tarea en un repositorio Git </w:t>
-      </w:r>
-      <w:proofErr w:type="spellStart"/>
-      <w:r>
-        <w:rPr>
-          <w:lang w:val="es-ES"/>
-        </w:rPr>
-        <w:t>Lab</w:t>
-      </w:r>
-      <w:proofErr w:type="spellEnd"/>
-      <w:r>
-        <w:rPr>
-          <w:lang w:val="es-ES"/>
-        </w:rPr>
-        <w:t xml:space="preserve"> o Git </w:t>
-      </w:r>
-      <w:proofErr w:type="gramStart"/>
-      <w:r>
-        <w:rPr>
-          <w:lang w:val="es-ES"/>
-        </w:rPr>
-        <w:t>Hub</w:t>
-      </w:r>
-      <w:proofErr w:type="gramEnd"/>
-      <w:r>
-        <w:rPr>
-          <w:lang w:val="es-ES"/>
-        </w:rPr>
-        <w:t xml:space="preserve">. El repositorio debe estar bien identificado con el nombre del curso y los miembros del equipo (grupo). En cada carpeta debe colocar los informes y productos entregables que le solicita el docente. NOTA: En cada carpeta de tarea NO DEBE COLOCAR el video, solamente el enlace al video. El video puede estar en </w:t>
-      </w:r>
-      <w:proofErr w:type="spellStart"/>
-      <w:r>
-        <w:rPr>
-          <w:lang w:val="es-ES"/>
-        </w:rPr>
-        <w:t>Youtube</w:t>
-      </w:r>
-      <w:proofErr w:type="spellEnd"/>
-      <w:r>
-        <w:rPr>
-          <w:lang w:val="es-ES"/>
-        </w:rPr>
-        <w:t xml:space="preserve"> o en un DRIVER de un estudiante.</w:t>
+        <w:t>Colocar la tarea en un repositorio Git Lab o Git Hub. El repositorio debe estar bien identificado con el nombre del curso y los miembros del equipo (grupo). En cada carpeta debe colocar los informes y productos entregables que le solicita el docente. NOTA: En cada carpeta de tarea NO DEBE COLOCAR el video, solamente el enlace al video. El video puede estar en Youtube o en un DRIVER de un estudiante.</w:t>
       </w:r>
     </w:p>
     <w:p>
@@ -1588,87 +1401,7 @@
           <w:szCs w:val="24"/>
           <w:lang w:val="es-ES"/>
         </w:rPr>
-        <w:t xml:space="preserve">Fue propuesto por Peter Pin-Shan Chen en 1976, en su influyente artículo “The </w:t>
-      </w:r>
-      <w:proofErr w:type="spellStart"/>
-      <w:r>
-        <w:rPr>
-          <w:color w:val="000000" w:themeColor="text1"/>
-          <w:sz w:val="24"/>
-          <w:szCs w:val="24"/>
-          <w:lang w:val="es-ES"/>
-        </w:rPr>
-        <w:t>Entity-Relationship</w:t>
-      </w:r>
-      <w:proofErr w:type="spellEnd"/>
-      <w:r>
-        <w:rPr>
-          <w:color w:val="000000" w:themeColor="text1"/>
-          <w:sz w:val="24"/>
-          <w:szCs w:val="24"/>
-          <w:lang w:val="es-ES"/>
-        </w:rPr>
-        <w:t xml:space="preserve"> </w:t>
-      </w:r>
-      <w:proofErr w:type="spellStart"/>
-      <w:r>
-        <w:rPr>
-          <w:color w:val="000000" w:themeColor="text1"/>
-          <w:sz w:val="24"/>
-          <w:szCs w:val="24"/>
-          <w:lang w:val="es-ES"/>
-        </w:rPr>
-        <w:t>Model</w:t>
-      </w:r>
-      <w:proofErr w:type="spellEnd"/>
-      <w:r>
-        <w:rPr>
-          <w:color w:val="000000" w:themeColor="text1"/>
-          <w:sz w:val="24"/>
-          <w:szCs w:val="24"/>
-          <w:lang w:val="es-ES"/>
-        </w:rPr>
-        <w:t xml:space="preserve"> — </w:t>
-      </w:r>
-      <w:proofErr w:type="spellStart"/>
-      <w:r>
-        <w:rPr>
-          <w:color w:val="000000" w:themeColor="text1"/>
-          <w:sz w:val="24"/>
-          <w:szCs w:val="24"/>
-          <w:lang w:val="es-ES"/>
-        </w:rPr>
-        <w:t>Toward</w:t>
-      </w:r>
-      <w:proofErr w:type="spellEnd"/>
-      <w:r>
-        <w:rPr>
-          <w:color w:val="000000" w:themeColor="text1"/>
-          <w:sz w:val="24"/>
-          <w:szCs w:val="24"/>
-          <w:lang w:val="es-ES"/>
-        </w:rPr>
-        <w:t xml:space="preserve"> a </w:t>
-      </w:r>
-      <w:proofErr w:type="spellStart"/>
-      <w:r>
-        <w:rPr>
-          <w:color w:val="000000" w:themeColor="text1"/>
-          <w:sz w:val="24"/>
-          <w:szCs w:val="24"/>
-          <w:lang w:val="es-ES"/>
-        </w:rPr>
-        <w:t>Unified</w:t>
-      </w:r>
-      <w:proofErr w:type="spellEnd"/>
-      <w:r>
-        <w:rPr>
-          <w:color w:val="000000" w:themeColor="text1"/>
-          <w:sz w:val="24"/>
-          <w:szCs w:val="24"/>
-          <w:lang w:val="es-ES"/>
-        </w:rPr>
-        <w:t xml:space="preserve"> View of Data”.</w:t>
+        <w:t>Fue propuesto por Peter Pin-Shan Chen en 1976, en su influyente artículo “The Entity-Relationship Model — Toward a Unified View of Data”.</w:t>
       </w:r>
     </w:p>
     <w:p>
@@ -2248,9 +1981,15 @@
           <w:szCs w:val="24"/>
           <w:lang w:val="es-ES"/>
         </w:rPr>
-        <w:t>3. Modelo Entidad-Relación con Notación “</w:t>
-      </w:r>
-      <w:proofErr w:type="spellStart"/>
+        <w:t>3. Modelo Entidad-Relación con Notación “Crow’s Foot” (Pata de Cuervo)</w:t>
+      </w:r>
+    </w:p>
+    <w:p>
+      <w:pPr>
+        <w:spacing w:after="0"/>
+        <w:ind w:left="720"/>
+        <w:jc w:val="both"/>
+      </w:pPr>
       <w:r>
         <w:rPr>
           <w:b/>
@@ -2258,11 +1997,39 @@
           <w:color w:val="000000" w:themeColor="text1"/>
           <w:sz w:val="24"/>
           <w:szCs w:val="24"/>
+          <w:u w:val="single"/>
+        </w:rPr>
+        <w:t>Definición</w:t>
+      </w:r>
+    </w:p>
+    <w:p>
+      <w:pPr>
+        <w:spacing w:after="0"/>
+        <w:ind w:left="720"/>
+        <w:jc w:val="both"/>
+      </w:pPr>
+      <w:r>
+        <w:rPr>
+          <w:color w:val="000000" w:themeColor="text1"/>
+          <w:sz w:val="24"/>
+          <w:szCs w:val="24"/>
           <w:lang w:val="es-ES"/>
         </w:rPr>
-        <w:t>Crow’s</w:t>
-      </w:r>
-      <w:proofErr w:type="spellEnd"/>
+        <w:t>Crow’s Foot Notation es un estilo gráfico para representar diagramas entidad-relación que enfatiza la cardinalidad mediante símbolos visuales —como “picaduras de cuervo” para muchas, líneas para una, círculos para opcionalidad— directamente en las conexiones entre entidades.</w:t>
+      </w:r>
+    </w:p>
+    <w:p>
+      <w:pPr>
+        <w:spacing w:after="0"/>
+        <w:jc w:val="both"/>
+      </w:pPr>
+    </w:p>
+    <w:p>
+      <w:pPr>
+        <w:spacing w:after="0"/>
+        <w:ind w:left="720"/>
+        <w:jc w:val="both"/>
+      </w:pPr>
       <w:r>
         <w:rPr>
           <w:b/>
@@ -2270,11 +2037,40 @@
           <w:color w:val="000000" w:themeColor="text1"/>
           <w:sz w:val="24"/>
           <w:szCs w:val="24"/>
+          <w:u w:val="single"/>
+        </w:rPr>
+        <w:t>Autor / Origen</w:t>
+      </w:r>
+    </w:p>
+    <w:p>
+      <w:pPr>
+        <w:spacing w:after="0"/>
+        <w:ind w:left="720"/>
+        <w:jc w:val="both"/>
+      </w:pPr>
+      <w:r>
+        <w:rPr>
+          <w:color w:val="000000" w:themeColor="text1"/>
+          <w:sz w:val="24"/>
+          <w:szCs w:val="24"/>
           <w:lang w:val="es-ES"/>
         </w:rPr>
-        <w:t xml:space="preserve"> </w:t>
-      </w:r>
-      <w:proofErr w:type="spellStart"/>
+        <w:lastRenderedPageBreak/>
+        <w:t>Fue introducido en los años 70 por Gordon Everest, con símbolos inspirados en “inverted arrows” o “chicken feet”, popularizado más tarde en entornos como ICL y Oracle (Barker).</w:t>
+      </w:r>
+    </w:p>
+    <w:p>
+      <w:pPr>
+        <w:spacing w:after="0"/>
+        <w:jc w:val="both"/>
+      </w:pPr>
+    </w:p>
+    <w:p>
+      <w:pPr>
+        <w:spacing w:after="0"/>
+        <w:ind w:left="720"/>
+        <w:jc w:val="both"/>
+      </w:pPr>
       <w:r>
         <w:rPr>
           <w:b/>
@@ -2282,11 +2078,69 @@
           <w:color w:val="000000" w:themeColor="text1"/>
           <w:sz w:val="24"/>
           <w:szCs w:val="24"/>
+          <w:u w:val="single"/>
+        </w:rPr>
+        <w:t>Características</w:t>
+      </w:r>
+    </w:p>
+    <w:p>
+      <w:pPr>
+        <w:spacing w:after="0"/>
+        <w:ind w:left="720"/>
+        <w:jc w:val="both"/>
+      </w:pPr>
+      <w:r>
+        <w:rPr>
+          <w:color w:val="000000" w:themeColor="text1"/>
+          <w:sz w:val="24"/>
+          <w:szCs w:val="24"/>
           <w:lang w:val="es-ES"/>
         </w:rPr>
-        <w:t>Foot</w:t>
-      </w:r>
-      <w:proofErr w:type="spellEnd"/>
+        <w:t>Entidades como rectángulos, relaciones como líneas sin diamantes, y cardinalidad/opcionalidad indicadas con iconos al final de líneas: dash (uno), crow's foot (muchos), círculo (opcional).</w:t>
+      </w:r>
+    </w:p>
+    <w:p>
+      <w:pPr>
+        <w:spacing w:after="0"/>
+        <w:ind w:left="720"/>
+        <w:jc w:val="both"/>
+      </w:pPr>
+      <w:r>
+        <w:rPr>
+          <w:color w:val="000000" w:themeColor="text1"/>
+          <w:sz w:val="24"/>
+          <w:szCs w:val="24"/>
+        </w:rPr>
+        <w:t>Claridad visual y eficiencia en el espacio, ideal para diagramas grandes.</w:t>
+      </w:r>
+    </w:p>
+    <w:p>
+      <w:pPr>
+        <w:spacing w:after="0"/>
+        <w:ind w:left="720"/>
+        <w:jc w:val="both"/>
+      </w:pPr>
+      <w:r>
+        <w:rPr>
+          <w:color w:val="000000" w:themeColor="text1"/>
+          <w:sz w:val="24"/>
+          <w:szCs w:val="24"/>
+        </w:rPr>
+        <w:t>Muy intuitiva, facilita la comunicación entre técnicos y no técnicos.</w:t>
+      </w:r>
+    </w:p>
+    <w:p>
+      <w:pPr>
+        <w:spacing w:after="0"/>
+        <w:jc w:val="both"/>
+      </w:pPr>
+    </w:p>
+    <w:p>
+      <w:pPr>
+        <w:spacing w:after="0"/>
+        <w:ind w:left="720"/>
+        <w:jc w:val="both"/>
+      </w:pPr>
       <w:r>
         <w:rPr>
           <w:b/>
@@ -2294,9 +2148,9 @@
           <w:color w:val="000000" w:themeColor="text1"/>
           <w:sz w:val="24"/>
           <w:szCs w:val="24"/>
-          <w:lang w:val="es-ES"/>
-        </w:rPr>
-        <w:t>” (Pata de Cuervo)</w:t>
+          <w:u w:val="single"/>
+        </w:rPr>
+        <w:t>Uso</w:t>
       </w:r>
     </w:p>
     <w:p>
@@ -2307,14 +2161,11 @@
       </w:pPr>
       <w:r>
         <w:rPr>
-          <w:b/>
-          <w:bCs/>
           <w:color w:val="000000" w:themeColor="text1"/>
           <w:sz w:val="24"/>
           <w:szCs w:val="24"/>
-          <w:u w:val="single"/>
-        </w:rPr>
-        <w:t>Definición</w:t>
+        </w:rPr>
+        <w:t>Diseño de bases de datos relacionales, modelado de procesos de negocio, planificación de arquitecturas de sistemas, documentación y enseñanza.</w:t>
       </w:r>
     </w:p>
     <w:p>
@@ -2323,7 +2174,6 @@
         <w:ind w:left="720"/>
         <w:jc w:val="both"/>
       </w:pPr>
-      <w:proofErr w:type="spellStart"/>
       <w:r>
         <w:rPr>
           <w:color w:val="000000" w:themeColor="text1"/>
@@ -2331,64 +2181,8 @@
           <w:szCs w:val="24"/>
           <w:lang w:val="es-ES"/>
         </w:rPr>
-        <w:t>Crow’s</w:t>
-      </w:r>
-      <w:proofErr w:type="spellEnd"/>
-      <w:r>
-        <w:rPr>
-          <w:color w:val="000000" w:themeColor="text1"/>
-          <w:sz w:val="24"/>
-          <w:szCs w:val="24"/>
-          <w:lang w:val="es-ES"/>
-        </w:rPr>
-        <w:t xml:space="preserve"> </w:t>
-      </w:r>
-      <w:proofErr w:type="spellStart"/>
-      <w:r>
-        <w:rPr>
-          <w:color w:val="000000" w:themeColor="text1"/>
-          <w:sz w:val="24"/>
-          <w:szCs w:val="24"/>
-          <w:lang w:val="es-ES"/>
-        </w:rPr>
-        <w:t>Foot</w:t>
-      </w:r>
-      <w:proofErr w:type="spellEnd"/>
-      <w:r>
-        <w:rPr>
-          <w:color w:val="000000" w:themeColor="text1"/>
-          <w:sz w:val="24"/>
-          <w:szCs w:val="24"/>
-          <w:lang w:val="es-ES"/>
-        </w:rPr>
-        <w:t xml:space="preserve"> </w:t>
-      </w:r>
-      <w:proofErr w:type="spellStart"/>
-      <w:r>
-        <w:rPr>
-          <w:color w:val="000000" w:themeColor="text1"/>
-          <w:sz w:val="24"/>
-          <w:szCs w:val="24"/>
-          <w:lang w:val="es-ES"/>
-        </w:rPr>
-        <w:t>Notation</w:t>
-      </w:r>
-      <w:proofErr w:type="spellEnd"/>
-      <w:r>
-        <w:rPr>
-          <w:color w:val="000000" w:themeColor="text1"/>
-          <w:sz w:val="24"/>
-          <w:szCs w:val="24"/>
-          <w:lang w:val="es-ES"/>
-        </w:rPr>
-        <w:t xml:space="preserve"> es un estilo gráfico para representar diagramas entidad-relación que enfatiza la cardinalidad mediante símbolos visuales —como “picaduras de cuervo” para muchas, líneas para una, círculos para opcionalidad— directamente en las conexiones entre entidades.</w:t>
-      </w:r>
-    </w:p>
-    <w:p>
-      <w:pPr>
-        <w:spacing w:after="0"/>
-        <w:jc w:val="both"/>
-      </w:pPr>
+        <w:t>Adoptado ampliamente en herramientas CASE y metodologías como Barker’s Notation y SSADM.</w:t>
+      </w:r>
     </w:p>
     <w:p>
       <w:pPr>
@@ -2398,370 +2192,10 @@
       </w:pPr>
       <w:r>
         <w:rPr>
-          <w:b/>
-          <w:bCs/>
-          <w:color w:val="000000" w:themeColor="text1"/>
-          <w:sz w:val="24"/>
-          <w:szCs w:val="24"/>
-          <w:u w:val="single"/>
-        </w:rPr>
-        <w:t>Autor / Origen</w:t>
-      </w:r>
-    </w:p>
-    <w:p>
-      <w:pPr>
-        <w:spacing w:after="0"/>
-        <w:ind w:left="720"/>
-        <w:jc w:val="both"/>
-      </w:pPr>
-      <w:r>
-        <w:rPr>
-          <w:color w:val="000000" w:themeColor="text1"/>
-          <w:sz w:val="24"/>
-          <w:szCs w:val="24"/>
-          <w:lang w:val="es-ES"/>
-        </w:rPr>
-        <w:lastRenderedPageBreak/>
-        <w:t>Fue introducido en los años 70 por Gordon Everest, con símbolos inspirados en “</w:t>
-      </w:r>
-      <w:proofErr w:type="spellStart"/>
-      <w:r>
-        <w:rPr>
-          <w:color w:val="000000" w:themeColor="text1"/>
-          <w:sz w:val="24"/>
-          <w:szCs w:val="24"/>
-          <w:lang w:val="es-ES"/>
-        </w:rPr>
-        <w:t>inverted</w:t>
-      </w:r>
-      <w:proofErr w:type="spellEnd"/>
-      <w:r>
-        <w:rPr>
-          <w:color w:val="000000" w:themeColor="text1"/>
-          <w:sz w:val="24"/>
-          <w:szCs w:val="24"/>
-          <w:lang w:val="es-ES"/>
-        </w:rPr>
-        <w:t xml:space="preserve"> </w:t>
-      </w:r>
-      <w:proofErr w:type="spellStart"/>
-      <w:r>
-        <w:rPr>
-          <w:color w:val="000000" w:themeColor="text1"/>
-          <w:sz w:val="24"/>
-          <w:szCs w:val="24"/>
-          <w:lang w:val="es-ES"/>
-        </w:rPr>
-        <w:t>arrows</w:t>
-      </w:r>
-      <w:proofErr w:type="spellEnd"/>
-      <w:r>
-        <w:rPr>
-          <w:color w:val="000000" w:themeColor="text1"/>
-          <w:sz w:val="24"/>
-          <w:szCs w:val="24"/>
-          <w:lang w:val="es-ES"/>
-        </w:rPr>
-        <w:t>” o “</w:t>
-      </w:r>
-      <w:proofErr w:type="spellStart"/>
-      <w:r>
-        <w:rPr>
-          <w:color w:val="000000" w:themeColor="text1"/>
-          <w:sz w:val="24"/>
-          <w:szCs w:val="24"/>
-          <w:lang w:val="es-ES"/>
-        </w:rPr>
-        <w:t>chicken</w:t>
-      </w:r>
-      <w:proofErr w:type="spellEnd"/>
-      <w:r>
-        <w:rPr>
-          <w:color w:val="000000" w:themeColor="text1"/>
-          <w:sz w:val="24"/>
-          <w:szCs w:val="24"/>
-          <w:lang w:val="es-ES"/>
-        </w:rPr>
-        <w:t xml:space="preserve"> </w:t>
-      </w:r>
-      <w:proofErr w:type="spellStart"/>
-      <w:r>
-        <w:rPr>
-          <w:color w:val="000000" w:themeColor="text1"/>
-          <w:sz w:val="24"/>
-          <w:szCs w:val="24"/>
-          <w:lang w:val="es-ES"/>
-        </w:rPr>
-        <w:t>feet</w:t>
-      </w:r>
-      <w:proofErr w:type="spellEnd"/>
-      <w:r>
-        <w:rPr>
-          <w:color w:val="000000" w:themeColor="text1"/>
-          <w:sz w:val="24"/>
-          <w:szCs w:val="24"/>
-          <w:lang w:val="es-ES"/>
-        </w:rPr>
-        <w:t>”, popularizado más tarde en entornos como ICL y Oracle (Barker).</w:t>
-      </w:r>
-    </w:p>
-    <w:p>
-      <w:pPr>
-        <w:spacing w:after="0"/>
-        <w:jc w:val="both"/>
-      </w:pPr>
-    </w:p>
-    <w:p>
-      <w:pPr>
-        <w:spacing w:after="0"/>
-        <w:ind w:left="720"/>
-        <w:jc w:val="both"/>
-      </w:pPr>
-      <w:r>
-        <w:rPr>
-          <w:b/>
-          <w:bCs/>
-          <w:color w:val="000000" w:themeColor="text1"/>
-          <w:sz w:val="24"/>
-          <w:szCs w:val="24"/>
-          <w:u w:val="single"/>
-        </w:rPr>
-        <w:t>Características</w:t>
-      </w:r>
-    </w:p>
-    <w:p>
-      <w:pPr>
-        <w:spacing w:after="0"/>
-        <w:ind w:left="720"/>
-        <w:jc w:val="both"/>
-      </w:pPr>
-      <w:r>
-        <w:rPr>
-          <w:color w:val="000000" w:themeColor="text1"/>
-          <w:sz w:val="24"/>
-          <w:szCs w:val="24"/>
-          <w:lang w:val="es-ES"/>
-        </w:rPr>
-        <w:t>Entidades como rectángulos, relaciones como líneas sin diamantes, y cardinalidad/</w:t>
-      </w:r>
-      <w:proofErr w:type="gramStart"/>
-      <w:r>
-        <w:rPr>
-          <w:color w:val="000000" w:themeColor="text1"/>
-          <w:sz w:val="24"/>
-          <w:szCs w:val="24"/>
-          <w:lang w:val="es-ES"/>
-        </w:rPr>
-        <w:t>opcionalidad indicadas</w:t>
-      </w:r>
-      <w:proofErr w:type="gramEnd"/>
-      <w:r>
-        <w:rPr>
-          <w:color w:val="000000" w:themeColor="text1"/>
-          <w:sz w:val="24"/>
-          <w:szCs w:val="24"/>
-          <w:lang w:val="es-ES"/>
-        </w:rPr>
-        <w:t xml:space="preserve"> con iconos al final de líneas: </w:t>
-      </w:r>
-      <w:proofErr w:type="spellStart"/>
-      <w:r>
-        <w:rPr>
-          <w:color w:val="000000" w:themeColor="text1"/>
-          <w:sz w:val="24"/>
-          <w:szCs w:val="24"/>
-          <w:lang w:val="es-ES"/>
-        </w:rPr>
-        <w:t>dash</w:t>
-      </w:r>
-      <w:proofErr w:type="spellEnd"/>
-      <w:r>
-        <w:rPr>
-          <w:color w:val="000000" w:themeColor="text1"/>
-          <w:sz w:val="24"/>
-          <w:szCs w:val="24"/>
-          <w:lang w:val="es-ES"/>
-        </w:rPr>
-        <w:t xml:space="preserve"> (uno), </w:t>
-      </w:r>
-      <w:proofErr w:type="spellStart"/>
-      <w:r>
-        <w:rPr>
-          <w:color w:val="000000" w:themeColor="text1"/>
-          <w:sz w:val="24"/>
-          <w:szCs w:val="24"/>
-          <w:lang w:val="es-ES"/>
-        </w:rPr>
-        <w:t>crow's</w:t>
-      </w:r>
-      <w:proofErr w:type="spellEnd"/>
-      <w:r>
-        <w:rPr>
-          <w:color w:val="000000" w:themeColor="text1"/>
-          <w:sz w:val="24"/>
-          <w:szCs w:val="24"/>
-          <w:lang w:val="es-ES"/>
-        </w:rPr>
-        <w:t xml:space="preserve"> </w:t>
-      </w:r>
-      <w:proofErr w:type="spellStart"/>
-      <w:r>
-        <w:rPr>
-          <w:color w:val="000000" w:themeColor="text1"/>
-          <w:sz w:val="24"/>
-          <w:szCs w:val="24"/>
-          <w:lang w:val="es-ES"/>
-        </w:rPr>
-        <w:t>foot</w:t>
-      </w:r>
-      <w:proofErr w:type="spellEnd"/>
-      <w:r>
-        <w:rPr>
-          <w:color w:val="000000" w:themeColor="text1"/>
-          <w:sz w:val="24"/>
-          <w:szCs w:val="24"/>
-          <w:lang w:val="es-ES"/>
-        </w:rPr>
-        <w:t xml:space="preserve"> (muchos), círculo (opcional).</w:t>
-      </w:r>
-    </w:p>
-    <w:p>
-      <w:pPr>
-        <w:spacing w:after="0"/>
-        <w:ind w:left="720"/>
-        <w:jc w:val="both"/>
-      </w:pPr>
-      <w:r>
-        <w:rPr>
-          <w:color w:val="000000" w:themeColor="text1"/>
-          <w:sz w:val="24"/>
-          <w:szCs w:val="24"/>
-        </w:rPr>
-        <w:t>Claridad visual y eficiencia en el espacio, ideal para diagramas grandes.</w:t>
-      </w:r>
-    </w:p>
-    <w:p>
-      <w:pPr>
-        <w:spacing w:after="0"/>
-        <w:ind w:left="720"/>
-        <w:jc w:val="both"/>
-      </w:pPr>
-      <w:r>
-        <w:rPr>
-          <w:color w:val="000000" w:themeColor="text1"/>
-          <w:sz w:val="24"/>
-          <w:szCs w:val="24"/>
-        </w:rPr>
-        <w:t>Muy intuitiva, facilita la comunicación entre técnicos y no técnicos.</w:t>
-      </w:r>
-    </w:p>
-    <w:p>
-      <w:pPr>
-        <w:spacing w:after="0"/>
-        <w:jc w:val="both"/>
-      </w:pPr>
-    </w:p>
-    <w:p>
-      <w:pPr>
-        <w:spacing w:after="0"/>
-        <w:ind w:left="720"/>
-        <w:jc w:val="both"/>
-      </w:pPr>
-      <w:r>
-        <w:rPr>
-          <w:b/>
-          <w:bCs/>
-          <w:color w:val="000000" w:themeColor="text1"/>
-          <w:sz w:val="24"/>
-          <w:szCs w:val="24"/>
-          <w:u w:val="single"/>
-        </w:rPr>
-        <w:t>Uso</w:t>
-      </w:r>
-    </w:p>
-    <w:p>
-      <w:pPr>
-        <w:spacing w:after="0"/>
-        <w:ind w:left="720"/>
-        <w:jc w:val="both"/>
-      </w:pPr>
-      <w:r>
-        <w:rPr>
-          <w:color w:val="000000" w:themeColor="text1"/>
-          <w:sz w:val="24"/>
-          <w:szCs w:val="24"/>
-        </w:rPr>
-        <w:t>Diseño de bases de datos relacionales, modelado de procesos de negocio, planificación de arquitecturas de sistemas, documentación y enseñanza.</w:t>
-      </w:r>
-    </w:p>
-    <w:p>
-      <w:pPr>
-        <w:spacing w:after="0"/>
-        <w:ind w:left="720"/>
-        <w:jc w:val="both"/>
-      </w:pPr>
-      <w:r>
-        <w:rPr>
-          <w:color w:val="000000" w:themeColor="text1"/>
-          <w:sz w:val="24"/>
-          <w:szCs w:val="24"/>
-          <w:lang w:val="es-ES"/>
-        </w:rPr>
-        <w:t xml:space="preserve">Adoptado ampliamente en herramientas CASE y metodologías como </w:t>
-      </w:r>
-      <w:proofErr w:type="spellStart"/>
-      <w:r>
-        <w:rPr>
-          <w:color w:val="000000" w:themeColor="text1"/>
-          <w:sz w:val="24"/>
-          <w:szCs w:val="24"/>
-          <w:lang w:val="es-ES"/>
-        </w:rPr>
-        <w:t>Barker’s</w:t>
-      </w:r>
-      <w:proofErr w:type="spellEnd"/>
-      <w:r>
-        <w:rPr>
-          <w:color w:val="000000" w:themeColor="text1"/>
-          <w:sz w:val="24"/>
-          <w:szCs w:val="24"/>
-          <w:lang w:val="es-ES"/>
-        </w:rPr>
-        <w:t xml:space="preserve"> </w:t>
-      </w:r>
-      <w:proofErr w:type="spellStart"/>
-      <w:r>
-        <w:rPr>
-          <w:color w:val="000000" w:themeColor="text1"/>
-          <w:sz w:val="24"/>
-          <w:szCs w:val="24"/>
-          <w:lang w:val="es-ES"/>
-        </w:rPr>
-        <w:t>Notation</w:t>
-      </w:r>
-      <w:proofErr w:type="spellEnd"/>
-      <w:r>
-        <w:rPr>
-          <w:color w:val="000000" w:themeColor="text1"/>
-          <w:sz w:val="24"/>
-          <w:szCs w:val="24"/>
-          <w:lang w:val="es-ES"/>
-        </w:rPr>
-        <w:t xml:space="preserve"> y SSADM.</w:t>
-      </w:r>
-    </w:p>
-    <w:p>
-      <w:pPr>
-        <w:spacing w:after="0"/>
-        <w:ind w:left="720"/>
-        <w:jc w:val="both"/>
-      </w:pPr>
-      <w:r>
-        <w:rPr>
           <w:noProof/>
         </w:rPr>
         <w:drawing>
-          <wp:inline distT="0" distB="0" distL="0" distR="0" wp14:anchorId="3D516E58" wp14:editId="56D4DB05">
+          <wp:inline distT="0" distB="0" distL="0" distR="0" wp14:anchorId="3D516E58" wp14:editId="5BA76001">
             <wp:extent cx="4667250" cy="3600450"/>
             <wp:effectExtent l="0" t="0" r="0" b="0"/>
             <wp:docPr id="909659855" name="drawing"/>
@@ -2826,7 +2260,6 @@
           <w:lang w:val="en-US"/>
         </w:rPr>
       </w:pPr>
-      <w:proofErr w:type="spellStart"/>
       <w:r>
         <w:rPr>
           <w:b/>
@@ -2836,19 +2269,7 @@
           <w:u w:val="single"/>
           <w:lang w:val="en-US"/>
         </w:rPr>
-        <w:t>Modelo</w:t>
-      </w:r>
-      <w:proofErr w:type="spellEnd"/>
-      <w:r>
-        <w:rPr>
-          <w:b/>
-          <w:color w:val="000000" w:themeColor="text1"/>
-          <w:sz w:val="24"/>
-          <w:szCs w:val="24"/>
-          <w:u w:val="single"/>
-          <w:lang w:val="en-US"/>
-        </w:rPr>
-        <w:t xml:space="preserve"> Unified Modeling Language (UML)</w:t>
+        <w:t>Modelo Unified Modeling Language (UML)</w:t>
       </w:r>
     </w:p>
     <w:p>
@@ -3358,16 +2779,8 @@
         <w:rPr>
           <w:lang w:val="es-ES"/>
         </w:rPr>
-        <w:t xml:space="preserve">Oracle CASE </w:t>
-      </w:r>
-      <w:proofErr w:type="spellStart"/>
-      <w:r>
-        <w:rPr>
-          <w:lang w:val="es-ES"/>
-        </w:rPr>
-        <w:t>Method</w:t>
-      </w:r>
-      <w:proofErr w:type="spellEnd"/>
+        <w:t>Oracle CASE Method</w:t>
+      </w:r>
       <w:r>
         <w:rPr>
           <w:lang w:val="es-ES"/>
@@ -3521,34 +2934,14 @@
         </w:rPr>
         <w:t xml:space="preserve">Usa la notación </w:t>
       </w:r>
-      <w:proofErr w:type="spellStart"/>
       <w:r>
         <w:rPr>
           <w:b/>
           <w:bCs/>
           <w:lang w:val="es-ES"/>
         </w:rPr>
-        <w:t>Crow’s</w:t>
-      </w:r>
-      <w:proofErr w:type="spellEnd"/>
-      <w:r>
-        <w:rPr>
-          <w:b/>
-          <w:bCs/>
-          <w:lang w:val="es-ES"/>
-        </w:rPr>
-        <w:t xml:space="preserve"> </w:t>
-      </w:r>
-      <w:proofErr w:type="spellStart"/>
-      <w:r>
-        <w:rPr>
-          <w:b/>
-          <w:bCs/>
-          <w:lang w:val="es-ES"/>
-        </w:rPr>
-        <w:t>Foot</w:t>
-      </w:r>
-      <w:proofErr w:type="spellEnd"/>
+        <w:t>Crow’s Foot</w:t>
+      </w:r>
       <w:r>
         <w:rPr>
           <w:lang w:val="es-ES"/>
@@ -3776,18 +3169,8 @@
           <w:bCs/>
           <w:lang w:val="es-ES"/>
         </w:rPr>
-        <w:t xml:space="preserve">Oracle </w:t>
-      </w:r>
-      <w:proofErr w:type="spellStart"/>
-      <w:r>
-        <w:rPr>
-          <w:b/>
-          <w:bCs/>
-          <w:lang w:val="es-ES"/>
-        </w:rPr>
-        <w:t>Designer</w:t>
-      </w:r>
-      <w:proofErr w:type="spellEnd"/>
+        <w:t>Oracle Designer</w:t>
+      </w:r>
       <w:r>
         <w:rPr>
           <w:lang w:val="es-ES"/>
@@ -3885,95 +3268,7 @@
           <w:color w:val="000000"/>
           <w:lang w:val="es-CO"/>
         </w:rPr>
-        <w:t>Modelo de IDEF1X (</w:t>
-      </w:r>
-      <w:proofErr w:type="spellStart"/>
-      <w:r>
-        <w:rPr>
-          <w:rFonts w:eastAsia="Times New Roman"/>
-          <w:b/>
-          <w:bCs/>
-          <w:color w:val="000000"/>
-          <w:lang w:val="es-CO"/>
-        </w:rPr>
-        <w:t>Integration</w:t>
-      </w:r>
-      <w:proofErr w:type="spellEnd"/>
-      <w:r>
-        <w:rPr>
-          <w:rFonts w:eastAsia="Times New Roman"/>
-          <w:b/>
-          <w:bCs/>
-          <w:color w:val="000000"/>
-          <w:lang w:val="es-CO"/>
-        </w:rPr>
-        <w:t xml:space="preserve"> </w:t>
-      </w:r>
-      <w:proofErr w:type="spellStart"/>
-      <w:r>
-        <w:rPr>
-          <w:rFonts w:eastAsia="Times New Roman"/>
-          <w:b/>
-          <w:bCs/>
-          <w:color w:val="000000"/>
-          <w:lang w:val="es-CO"/>
-        </w:rPr>
-        <w:t>Definition</w:t>
-      </w:r>
-      <w:proofErr w:type="spellEnd"/>
-      <w:r>
-        <w:rPr>
-          <w:rFonts w:eastAsia="Times New Roman"/>
-          <w:b/>
-          <w:bCs/>
-          <w:color w:val="000000"/>
-          <w:lang w:val="es-CO"/>
-        </w:rPr>
-        <w:t xml:space="preserve"> for </w:t>
-      </w:r>
-      <w:proofErr w:type="spellStart"/>
-      <w:r>
-        <w:rPr>
-          <w:rFonts w:eastAsia="Times New Roman"/>
-          <w:b/>
-          <w:bCs/>
-          <w:color w:val="000000"/>
-          <w:lang w:val="es-CO"/>
-        </w:rPr>
-        <w:t>Information</w:t>
-      </w:r>
-      <w:proofErr w:type="spellEnd"/>
-      <w:r>
-        <w:rPr>
-          <w:rFonts w:eastAsia="Times New Roman"/>
-          <w:b/>
-          <w:bCs/>
-          <w:color w:val="000000"/>
-          <w:lang w:val="es-CO"/>
-        </w:rPr>
-        <w:t xml:space="preserve"> </w:t>
-      </w:r>
-      <w:proofErr w:type="spellStart"/>
-      <w:r>
-        <w:rPr>
-          <w:rFonts w:eastAsia="Times New Roman"/>
-          <w:b/>
-          <w:bCs/>
-          <w:color w:val="000000"/>
-          <w:lang w:val="es-CO"/>
-        </w:rPr>
-        <w:t>Modelingc</w:t>
-      </w:r>
-      <w:proofErr w:type="spellEnd"/>
-      <w:r>
-        <w:rPr>
-          <w:rFonts w:eastAsia="Times New Roman"/>
-          <w:b/>
-          <w:bCs/>
-          <w:color w:val="000000"/>
-          <w:lang w:val="es-CO"/>
-        </w:rPr>
-        <w:t>)</w:t>
+        <w:t>Modelo de IDEF1X (Integration Definition for Information Modelingc)</w:t>
       </w:r>
     </w:p>
     <w:p>
@@ -4045,71 +3340,7 @@
           <w:rFonts w:eastAsia="Times New Roman"/>
           <w:color w:val="000000"/>
         </w:rPr>
-        <w:t xml:space="preserve">desarrollado por Robert R. Brown y Timothy L. Ramey de Hughes </w:t>
-      </w:r>
-      <w:proofErr w:type="spellStart"/>
-      <w:r>
-        <w:rPr>
-          <w:rFonts w:eastAsia="Times New Roman"/>
-          <w:color w:val="000000"/>
-        </w:rPr>
-        <w:t>Aircraft</w:t>
-      </w:r>
-      <w:proofErr w:type="spellEnd"/>
-      <w:r>
-        <w:rPr>
-          <w:rFonts w:eastAsia="Times New Roman"/>
-          <w:color w:val="000000"/>
-        </w:rPr>
-        <w:t xml:space="preserve"> en colaboración con Dan Appleton y </w:t>
-      </w:r>
-      <w:proofErr w:type="spellStart"/>
-      <w:r>
-        <w:rPr>
-          <w:rFonts w:eastAsia="Times New Roman"/>
-          <w:color w:val="000000"/>
-        </w:rPr>
-        <w:t>Stu</w:t>
-      </w:r>
-      <w:proofErr w:type="spellEnd"/>
-      <w:r>
-        <w:rPr>
-          <w:rFonts w:eastAsia="Times New Roman"/>
-          <w:color w:val="000000"/>
-        </w:rPr>
-        <w:t xml:space="preserve"> Coleman (DACOM), recibiendo influencia de figuras como Charles Bachman, Peter Chen, M. A. </w:t>
-      </w:r>
-      <w:proofErr w:type="spellStart"/>
-      <w:r>
-        <w:rPr>
-          <w:rFonts w:eastAsia="Times New Roman"/>
-          <w:color w:val="000000"/>
-        </w:rPr>
-        <w:t>Melkanoff</w:t>
-      </w:r>
-      <w:proofErr w:type="spellEnd"/>
-      <w:r>
-        <w:rPr>
-          <w:rFonts w:eastAsia="Times New Roman"/>
-          <w:color w:val="000000"/>
-        </w:rPr>
-        <w:t xml:space="preserve"> y G. M. </w:t>
-      </w:r>
-      <w:proofErr w:type="spellStart"/>
-      <w:r>
-        <w:rPr>
-          <w:rFonts w:eastAsia="Times New Roman"/>
-          <w:color w:val="000000"/>
-        </w:rPr>
-        <w:t>Nijssen</w:t>
-      </w:r>
-      <w:proofErr w:type="spellEnd"/>
-      <w:r>
-        <w:rPr>
-          <w:rFonts w:eastAsia="Times New Roman"/>
-          <w:color w:val="000000"/>
-        </w:rPr>
-        <w:t>.</w:t>
+        <w:t>desarrollado por Robert R. Brown y Timothy L. Ramey de Hughes Aircraft en colaboración con Dan Appleton y Stu Coleman (DACOM), recibiendo influencia de figuras como Charles Bachman, Peter Chen, M. A. Melkanoff y G. M. Nijssen.</w:t>
       </w:r>
       <w:r>
         <w:rPr>
@@ -4575,35 +3806,7 @@
         <w:rPr>
           <w:color w:val="000000"/>
         </w:rPr>
-        <w:t>El modelo Min-Max, también conocido como notación (</w:t>
-      </w:r>
-      <w:proofErr w:type="spellStart"/>
-      <w:r>
-        <w:rPr>
-          <w:color w:val="000000"/>
-        </w:rPr>
-        <w:t>min,max</w:t>
-      </w:r>
-      <w:proofErr w:type="spellEnd"/>
-      <w:r>
-        <w:rPr>
-          <w:color w:val="000000"/>
-        </w:rPr>
-        <w:t xml:space="preserve">), fue propuesto por Jean-Raymond </w:t>
-      </w:r>
-      <w:proofErr w:type="spellStart"/>
-      <w:r>
-        <w:rPr>
-          <w:color w:val="000000"/>
-        </w:rPr>
-        <w:t>Abrial</w:t>
-      </w:r>
-      <w:proofErr w:type="spellEnd"/>
-      <w:r>
-        <w:rPr>
-          <w:color w:val="000000"/>
-        </w:rPr>
-        <w:t xml:space="preserve"> en 1974 como una alternativa a la notación de Chen para representar restricciones de participación en modelos Entidad-Relación (ER). A diferencia de la notación tradicional, permite especificar de forma explícita el número mínimo y máximo de veces que una entidad puede participar en una relación.</w:t>
+        <w:t>El modelo Min-Max, también conocido como notación (min,max), fue propuesto por Jean-Raymond Abrial en 1974 como una alternativa a la notación de Chen para representar restricciones de participación en modelos Entidad-Relación (ER). A diferencia de la notación tradicional, permite especificar de forma explícita el número mínimo y máximo de veces que una entidad puede participar en una relación.</w:t>
       </w:r>
       <w:sdt>
         <w:sdtPr>
@@ -4693,21 +3896,7 @@
         <w:rPr>
           <w:color w:val="000000"/>
         </w:rPr>
-        <w:t>Este modelo se caracteriza porque a cada entidad participante en una relación se le asigna un par de valores: el mínimo (min) y el máximo (</w:t>
-      </w:r>
-      <w:proofErr w:type="spellStart"/>
-      <w:r>
-        <w:rPr>
-          <w:color w:val="000000"/>
-        </w:rPr>
-        <w:t>max</w:t>
-      </w:r>
-      <w:proofErr w:type="spellEnd"/>
-      <w:r>
-        <w:rPr>
-          <w:color w:val="000000"/>
-        </w:rPr>
-        <w:t>). Por ejemplo, (1,1) indica que la participación de la entidad es obligatoria y exclusiva, mientras que (0,*) señala que la participación es opcional y sin límite superior. De esta manera, el modelo proporciona un nivel de precisión mayor que el ofrecido por la notación de Chen, lo que facilita representar restricciones del mundo real en el diseño de bases de datos.</w:t>
+        <w:t>Este modelo se caracteriza porque a cada entidad participante en una relación se le asigna un par de valores: el mínimo (min) y el máximo (max). Por ejemplo, (1,1) indica que la participación de la entidad es obligatoria y exclusiva, mientras que (0,*) señala que la participación es opcional y sin límite superior. De esta manera, el modelo proporciona un nivel de precisión mayor que el ofrecido por la notación de Chen, lo que facilita representar restricciones del mundo real en el diseño de bases de datos.</w:t>
       </w:r>
       <w:sdt>
         <w:sdtPr>
@@ -9190,43 +8379,7 @@
           <w:szCs w:val="24"/>
           <w:lang w:val="es-ES"/>
         </w:rPr>
-        <w:t xml:space="preserve">En la columna “Clave” debe colocar si el atributo es una clave primaria (PK, </w:t>
-      </w:r>
-      <w:proofErr w:type="spellStart"/>
-      <w:r>
-        <w:rPr>
-          <w:sz w:val="24"/>
-          <w:szCs w:val="24"/>
-          <w:lang w:val="es-ES"/>
-        </w:rPr>
-        <w:t>Primary</w:t>
-      </w:r>
-      <w:proofErr w:type="spellEnd"/>
-      <w:r>
-        <w:rPr>
-          <w:sz w:val="24"/>
-          <w:szCs w:val="24"/>
-          <w:lang w:val="es-ES"/>
-        </w:rPr>
-        <w:t xml:space="preserve"> Key) o clave foránea (FK, </w:t>
-      </w:r>
-      <w:proofErr w:type="spellStart"/>
-      <w:r>
-        <w:rPr>
-          <w:sz w:val="24"/>
-          <w:szCs w:val="24"/>
-          <w:lang w:val="es-ES"/>
-        </w:rPr>
-        <w:t>Foreign</w:t>
-      </w:r>
-      <w:proofErr w:type="spellEnd"/>
-      <w:r>
-        <w:rPr>
-          <w:sz w:val="24"/>
-          <w:szCs w:val="24"/>
-          <w:lang w:val="es-ES"/>
-        </w:rPr>
-        <w:t xml:space="preserve"> Key). Si no es ninguna de las anteriores, deje el espacio en blanco</w:t>
+        <w:t>En la columna “Clave” debe colocar si el atributo es una clave primaria (PK, Primary Key) o clave foránea (FK, Foreign Key). Si no es ninguna de las anteriores, deje el espacio en blanco</w:t>
       </w:r>
     </w:p>
     <w:p>
@@ -9478,7 +8631,6 @@
                 <w:lang w:val="es-ES"/>
               </w:rPr>
             </w:pPr>
-            <w:proofErr w:type="spellStart"/>
             <w:r>
               <w:rPr>
                 <w:sz w:val="24"/>
@@ -9487,7 +8639,6 @@
               </w:rPr>
               <w:t>id_zoológico</w:t>
             </w:r>
-            <w:proofErr w:type="spellEnd"/>
           </w:p>
         </w:tc>
         <w:tc>
@@ -9968,7 +9119,6 @@
                 <w:lang w:val="es-ES"/>
               </w:rPr>
             </w:pPr>
-            <w:proofErr w:type="spellStart"/>
             <w:r>
               <w:rPr>
                 <w:sz w:val="24"/>
@@ -9977,7 +9127,6 @@
               </w:rPr>
               <w:t>id_especie</w:t>
             </w:r>
-            <w:proofErr w:type="spellEnd"/>
           </w:p>
         </w:tc>
         <w:tc>
@@ -10060,7 +9209,6 @@
                 <w:lang w:val="es-ES"/>
               </w:rPr>
             </w:pPr>
-            <w:proofErr w:type="spellStart"/>
             <w:r>
               <w:rPr>
                 <w:sz w:val="24"/>
@@ -10069,7 +9217,6 @@
               </w:rPr>
               <w:t>nombre_es</w:t>
             </w:r>
-            <w:proofErr w:type="spellEnd"/>
           </w:p>
         </w:tc>
         <w:tc>
@@ -10144,7 +9291,6 @@
                 <w:lang w:val="es-ES"/>
               </w:rPr>
             </w:pPr>
-            <w:proofErr w:type="spellStart"/>
             <w:r>
               <w:rPr>
                 <w:sz w:val="24"/>
@@ -10153,7 +9299,6 @@
               </w:rPr>
               <w:t>nombre_ct</w:t>
             </w:r>
-            <w:proofErr w:type="spellEnd"/>
           </w:p>
         </w:tc>
         <w:tc>
@@ -10324,7 +9469,6 @@
                 <w:lang w:val="es-ES"/>
               </w:rPr>
             </w:pPr>
-            <w:proofErr w:type="spellStart"/>
             <w:r>
               <w:rPr>
                 <w:sz w:val="24"/>
@@ -10333,7 +9477,6 @@
               </w:rPr>
               <w:t>id_zona</w:t>
             </w:r>
-            <w:proofErr w:type="spellEnd"/>
           </w:p>
         </w:tc>
         <w:tc>
@@ -10416,7 +9559,6 @@
                 <w:lang w:val="es-ES"/>
               </w:rPr>
             </w:pPr>
-            <w:proofErr w:type="spellStart"/>
             <w:r>
               <w:rPr>
                 <w:sz w:val="24"/>
@@ -10425,7 +9567,6 @@
               </w:rPr>
               <w:t>Id_cuidador</w:t>
             </w:r>
-            <w:proofErr w:type="spellEnd"/>
           </w:p>
         </w:tc>
         <w:tc>
@@ -10742,7 +9883,6 @@
                 <w:lang w:val="es-ES"/>
               </w:rPr>
             </w:pPr>
-            <w:proofErr w:type="spellStart"/>
             <w:r>
               <w:rPr>
                 <w:sz w:val="24"/>
@@ -10751,7 +9891,6 @@
               </w:rPr>
               <w:t>Id_habitat</w:t>
             </w:r>
-            <w:proofErr w:type="spellEnd"/>
           </w:p>
         </w:tc>
         <w:tc>
@@ -10876,23 +10015,7 @@
                 <w:sz w:val="24"/>
                 <w:szCs w:val="24"/>
               </w:rPr>
-              <w:t xml:space="preserve">, </w:t>
-            </w:r>
-            <w:proofErr w:type="spellStart"/>
-            <w:r>
-              <w:rPr>
-                <w:sz w:val="24"/>
-                <w:szCs w:val="24"/>
-              </w:rPr>
-              <w:t>etc</w:t>
-            </w:r>
-            <w:proofErr w:type="spellEnd"/>
-            <w:r>
-              <w:rPr>
-                <w:sz w:val="24"/>
-                <w:szCs w:val="24"/>
-              </w:rPr>
-              <w:t>…</w:t>
+              <w:t>, etc…</w:t>
             </w:r>
           </w:p>
         </w:tc>
@@ -11110,7 +10233,6 @@
                 <w:lang w:val="es-ES"/>
               </w:rPr>
             </w:pPr>
-            <w:proofErr w:type="spellStart"/>
             <w:r>
               <w:rPr>
                 <w:sz w:val="24"/>
@@ -11119,7 +10241,6 @@
               </w:rPr>
               <w:t>tipo_vegetacion</w:t>
             </w:r>
-            <w:proofErr w:type="spellEnd"/>
           </w:p>
         </w:tc>
         <w:tc>
@@ -11194,7 +10315,6 @@
                 <w:lang w:val="es-ES"/>
               </w:rPr>
             </w:pPr>
-            <w:proofErr w:type="spellStart"/>
             <w:r>
               <w:rPr>
                 <w:sz w:val="24"/>
@@ -11203,7 +10323,6 @@
               </w:rPr>
               <w:t>Id_zona</w:t>
             </w:r>
-            <w:proofErr w:type="spellEnd"/>
           </w:p>
         </w:tc>
         <w:tc>
@@ -11520,7 +10639,6 @@
                 <w:lang w:val="es-ES"/>
               </w:rPr>
             </w:pPr>
-            <w:proofErr w:type="spellStart"/>
             <w:r>
               <w:rPr>
                 <w:sz w:val="24"/>
@@ -11529,7 +10647,6 @@
               </w:rPr>
               <w:t>Id_zonas</w:t>
             </w:r>
-            <w:proofErr w:type="spellEnd"/>
           </w:p>
         </w:tc>
         <w:tc>
@@ -11776,7 +10893,6 @@
                 <w:lang w:val="es-ES"/>
               </w:rPr>
             </w:pPr>
-            <w:proofErr w:type="spellStart"/>
             <w:r>
               <w:rPr>
                 <w:sz w:val="24"/>
@@ -11785,7 +10901,6 @@
               </w:rPr>
               <w:t>Id_zoológico</w:t>
             </w:r>
-            <w:proofErr w:type="spellEnd"/>
           </w:p>
         </w:tc>
         <w:tc>
@@ -12154,7 +11269,6 @@
                 <w:lang w:val="es-ES"/>
               </w:rPr>
             </w:pPr>
-            <w:proofErr w:type="spellStart"/>
             <w:r>
               <w:rPr>
                 <w:sz w:val="24"/>
@@ -12163,7 +11277,6 @@
               </w:rPr>
               <w:t>Id_itinerario</w:t>
             </w:r>
-            <w:proofErr w:type="spellEnd"/>
           </w:p>
         </w:tc>
         <w:tc>
@@ -12328,7 +11441,6 @@
                 <w:lang w:val="es-ES"/>
               </w:rPr>
             </w:pPr>
-            <w:proofErr w:type="spellStart"/>
             <w:r>
               <w:rPr>
                 <w:sz w:val="24"/>
@@ -12337,7 +11449,6 @@
               </w:rPr>
               <w:t>log_recorrido</w:t>
             </w:r>
-            <w:proofErr w:type="spellEnd"/>
           </w:p>
         </w:tc>
         <w:tc>
@@ -12412,7 +11523,6 @@
                 <w:lang w:val="es-ES"/>
               </w:rPr>
             </w:pPr>
-            <w:proofErr w:type="spellStart"/>
             <w:r>
               <w:rPr>
                 <w:sz w:val="24"/>
@@ -12421,7 +11531,6 @@
               </w:rPr>
               <w:t>Max_visitantes</w:t>
             </w:r>
-            <w:proofErr w:type="spellEnd"/>
           </w:p>
         </w:tc>
         <w:tc>
@@ -12730,7 +11839,6 @@
                 <w:lang w:val="es-ES"/>
               </w:rPr>
             </w:pPr>
-            <w:proofErr w:type="spellStart"/>
             <w:r>
               <w:rPr>
                 <w:sz w:val="24"/>
@@ -12739,7 +11847,6 @@
               </w:rPr>
               <w:t>Id_guia</w:t>
             </w:r>
-            <w:proofErr w:type="spellEnd"/>
           </w:p>
         </w:tc>
         <w:tc>
@@ -12994,7 +12101,6 @@
                 <w:lang w:val="es-ES"/>
               </w:rPr>
             </w:pPr>
-            <w:proofErr w:type="spellStart"/>
             <w:r>
               <w:rPr>
                 <w:sz w:val="24"/>
@@ -13003,7 +12109,6 @@
               </w:rPr>
               <w:t>telefono</w:t>
             </w:r>
-            <w:proofErr w:type="spellEnd"/>
           </w:p>
         </w:tc>
         <w:tc>
@@ -13086,7 +12191,6 @@
                 <w:lang w:val="es-ES"/>
               </w:rPr>
             </w:pPr>
-            <w:proofErr w:type="spellStart"/>
             <w:r>
               <w:rPr>
                 <w:sz w:val="24"/>
@@ -13095,7 +12199,6 @@
               </w:rPr>
               <w:t>fecha_inicio</w:t>
             </w:r>
-            <w:proofErr w:type="spellEnd"/>
           </w:p>
         </w:tc>
         <w:tc>
@@ -13404,7 +12507,6 @@
                 <w:lang w:val="es-ES"/>
               </w:rPr>
             </w:pPr>
-            <w:proofErr w:type="spellStart"/>
             <w:r>
               <w:rPr>
                 <w:sz w:val="24"/>
@@ -13413,7 +12515,6 @@
               </w:rPr>
               <w:t>id_cuidador</w:t>
             </w:r>
-            <w:proofErr w:type="spellEnd"/>
           </w:p>
         </w:tc>
         <w:tc>
@@ -13742,7 +12843,6 @@
                 <w:lang w:val="es-ES"/>
               </w:rPr>
             </w:pPr>
-            <w:proofErr w:type="spellStart"/>
             <w:r>
               <w:rPr>
                 <w:sz w:val="24"/>
@@ -13751,7 +12851,6 @@
               </w:rPr>
               <w:t>Fecha_ingreso</w:t>
             </w:r>
-            <w:proofErr w:type="spellEnd"/>
           </w:p>
         </w:tc>
         <w:tc>
@@ -13883,7 +12982,6 @@
                 <w:lang w:val="es-ES"/>
               </w:rPr>
             </w:pPr>
-            <w:proofErr w:type="spellStart"/>
             <w:r>
               <w:rPr>
                 <w:b/>
@@ -13894,7 +12992,6 @@
               </w:rPr>
               <w:t>Visitant</w:t>
             </w:r>
-            <w:proofErr w:type="spellEnd"/>
           </w:p>
         </w:tc>
         <w:tc>
@@ -14062,7 +13159,6 @@
                 <w:lang w:val="es-ES"/>
               </w:rPr>
             </w:pPr>
-            <w:proofErr w:type="spellStart"/>
             <w:r>
               <w:rPr>
                 <w:sz w:val="24"/>
@@ -14071,7 +13167,6 @@
               </w:rPr>
               <w:t>id_visitante</w:t>
             </w:r>
-            <w:proofErr w:type="spellEnd"/>
           </w:p>
         </w:tc>
         <w:tc>
@@ -14236,23 +13331,13 @@
                 <w:lang w:val="es-ES"/>
               </w:rPr>
             </w:pPr>
-            <w:proofErr w:type="spellStart"/>
-            <w:r>
-              <w:rPr>
-                <w:sz w:val="24"/>
-                <w:szCs w:val="24"/>
-                <w:lang w:val="es-ES"/>
-              </w:rPr>
-              <w:t>telefono</w:t>
-            </w:r>
-            <w:proofErr w:type="spellEnd"/>
-            <w:r>
-              <w:rPr>
-                <w:sz w:val="24"/>
-                <w:szCs w:val="24"/>
-                <w:lang w:val="es-ES"/>
-              </w:rPr>
-              <w:t xml:space="preserve"> </w:t>
+            <w:r>
+              <w:rPr>
+                <w:sz w:val="24"/>
+                <w:szCs w:val="24"/>
+                <w:lang w:val="es-ES"/>
+              </w:rPr>
+              <w:t xml:space="preserve">telefono </w:t>
             </w:r>
           </w:p>
         </w:tc>
@@ -14644,7 +13729,6 @@
                 <w:lang w:val="es-ES"/>
               </w:rPr>
             </w:pPr>
-            <w:proofErr w:type="spellStart"/>
             <w:r>
               <w:rPr>
                 <w:sz w:val="24"/>
@@ -14653,7 +13737,6 @@
               </w:rPr>
               <w:t>id_alimento</w:t>
             </w:r>
-            <w:proofErr w:type="spellEnd"/>
           </w:p>
         </w:tc>
         <w:tc>
@@ -15014,7 +14097,6 @@
                 <w:lang w:val="es-ES"/>
               </w:rPr>
             </w:pPr>
-            <w:proofErr w:type="spellStart"/>
             <w:r>
               <w:rPr>
                 <w:sz w:val="24"/>
@@ -15023,7 +14105,6 @@
               </w:rPr>
               <w:t>Id_especie</w:t>
             </w:r>
-            <w:proofErr w:type="spellEnd"/>
           </w:p>
         </w:tc>
         <w:tc>
@@ -15434,7 +14515,6 @@
                 <w:lang w:val="es-ES"/>
               </w:rPr>
             </w:pPr>
-            <w:proofErr w:type="spellStart"/>
             <w:r>
               <w:rPr>
                 <w:sz w:val="24"/>
@@ -15443,7 +14523,6 @@
               </w:rPr>
               <w:t>id_veterinario</w:t>
             </w:r>
-            <w:proofErr w:type="spellEnd"/>
           </w:p>
         </w:tc>
         <w:tc>
@@ -15698,7 +14777,6 @@
                 <w:lang w:val="es-ES"/>
               </w:rPr>
             </w:pPr>
-            <w:proofErr w:type="spellStart"/>
             <w:r>
               <w:rPr>
                 <w:sz w:val="24"/>
@@ -15707,7 +14785,6 @@
               </w:rPr>
               <w:t>hora_ingreso</w:t>
             </w:r>
-            <w:proofErr w:type="spellEnd"/>
           </w:p>
         </w:tc>
         <w:tc>
@@ -16108,7 +15185,6 @@
                 <w:lang w:val="es-ES"/>
               </w:rPr>
             </w:pPr>
-            <w:proofErr w:type="spellStart"/>
             <w:r>
               <w:rPr>
                 <w:sz w:val="24"/>
@@ -16117,7 +15193,6 @@
               </w:rPr>
               <w:t>id_animal</w:t>
             </w:r>
-            <w:proofErr w:type="spellEnd"/>
           </w:p>
         </w:tc>
         <w:tc>
@@ -16446,7 +15521,6 @@
                 <w:lang w:val="es-ES"/>
               </w:rPr>
             </w:pPr>
-            <w:proofErr w:type="spellStart"/>
             <w:r>
               <w:rPr>
                 <w:sz w:val="24"/>
@@ -16455,7 +15529,6 @@
               </w:rPr>
               <w:t>fecha_ingreso</w:t>
             </w:r>
-            <w:proofErr w:type="spellEnd"/>
           </w:p>
         </w:tc>
         <w:tc>
@@ -16530,7 +15603,6 @@
                 <w:lang w:val="es-ES"/>
               </w:rPr>
             </w:pPr>
-            <w:proofErr w:type="spellStart"/>
             <w:r>
               <w:rPr>
                 <w:sz w:val="24"/>
@@ -16539,7 +15611,6 @@
               </w:rPr>
               <w:t>id_especie</w:t>
             </w:r>
-            <w:proofErr w:type="spellEnd"/>
           </w:p>
         </w:tc>
         <w:tc>
@@ -16625,7 +15696,6 @@
                 <w:lang w:val="es-ES"/>
               </w:rPr>
             </w:pPr>
-            <w:proofErr w:type="spellStart"/>
             <w:r>
               <w:rPr>
                 <w:sz w:val="24"/>
@@ -16634,7 +15704,6 @@
               </w:rPr>
               <w:t>id_habitat</w:t>
             </w:r>
-            <w:proofErr w:type="spellEnd"/>
           </w:p>
         </w:tc>
         <w:tc>
@@ -16951,7 +16020,6 @@
                 <w:lang w:val="es-ES"/>
               </w:rPr>
             </w:pPr>
-            <w:proofErr w:type="spellStart"/>
             <w:r>
               <w:rPr>
                 <w:sz w:val="24"/>
@@ -16960,7 +16028,6 @@
               </w:rPr>
               <w:t>id_boleto</w:t>
             </w:r>
-            <w:proofErr w:type="spellEnd"/>
           </w:p>
         </w:tc>
         <w:tc>
@@ -17051,7 +16118,6 @@
                 <w:lang w:val="es-ES"/>
               </w:rPr>
             </w:pPr>
-            <w:proofErr w:type="spellStart"/>
             <w:r>
               <w:rPr>
                 <w:sz w:val="24"/>
@@ -17060,7 +16126,6 @@
               </w:rPr>
               <w:t>fecha_ingreso</w:t>
             </w:r>
-            <w:proofErr w:type="spellEnd"/>
           </w:p>
         </w:tc>
         <w:tc>
@@ -17135,7 +16200,6 @@
                 <w:lang w:val="es-ES"/>
               </w:rPr>
             </w:pPr>
-            <w:proofErr w:type="spellStart"/>
             <w:r>
               <w:rPr>
                 <w:sz w:val="24"/>
@@ -17144,7 +16208,6 @@
               </w:rPr>
               <w:t>hora_ingreso</w:t>
             </w:r>
-            <w:proofErr w:type="spellEnd"/>
           </w:p>
         </w:tc>
         <w:tc>
@@ -17309,7 +16372,6 @@
                 <w:lang w:val="es-ES"/>
               </w:rPr>
             </w:pPr>
-            <w:proofErr w:type="spellStart"/>
             <w:r>
               <w:rPr>
                 <w:sz w:val="24"/>
@@ -17318,7 +16380,6 @@
               </w:rPr>
               <w:t>Id_visitante</w:t>
             </w:r>
-            <w:proofErr w:type="spellEnd"/>
           </w:p>
         </w:tc>
         <w:tc>
@@ -17412,7 +16473,6 @@
                 <w:lang w:val="es-ES"/>
               </w:rPr>
             </w:pPr>
-            <w:proofErr w:type="spellStart"/>
             <w:r>
               <w:rPr>
                 <w:sz w:val="24"/>
@@ -17421,7 +16481,6 @@
               </w:rPr>
               <w:t>Id_zoológico</w:t>
             </w:r>
-            <w:proofErr w:type="spellEnd"/>
           </w:p>
         </w:tc>
         <w:tc>
@@ -17821,7 +16880,6 @@
               </w:rPr>
               <w:t xml:space="preserve"> </w:t>
             </w:r>
-            <w:proofErr w:type="spellStart"/>
             <w:r>
               <w:rPr>
                 <w:lang w:val="es-ES"/>
@@ -17831,7 +16889,6 @@
             <w:r>
               <w:t>ecie</w:t>
             </w:r>
-            <w:proofErr w:type="spellEnd"/>
           </w:p>
         </w:tc>
       </w:tr>
@@ -17899,7 +16956,6 @@
                 <w:lang w:val="es-ES"/>
               </w:rPr>
             </w:pPr>
-            <w:proofErr w:type="spellStart"/>
             <w:r>
               <w:rPr>
                 <w:color w:val="000000" w:themeColor="text1"/>
@@ -17918,7 +16974,6 @@
               </w:rPr>
               <w:t>t</w:t>
             </w:r>
-            <w:proofErr w:type="spellEnd"/>
           </w:p>
           <w:p>
             <w:pPr>
@@ -18228,7 +17283,6 @@
             <w:pPr>
               <w:jc w:val="both"/>
             </w:pPr>
-            <w:proofErr w:type="spellStart"/>
             <w:r>
               <w:rPr>
                 <w:rFonts w:ascii="Cambria" w:eastAsia="Cambria" w:hAnsi="Cambria" w:cs="Cambria"/>
@@ -18236,7 +17290,6 @@
               </w:rPr>
               <w:t>id_habitat</w:t>
             </w:r>
-            <w:proofErr w:type="spellEnd"/>
           </w:p>
         </w:tc>
         <w:tc>
@@ -18263,21 +17316,12 @@
                 <w:lang w:val="en-US"/>
               </w:rPr>
             </w:pPr>
-            <w:proofErr w:type="spellStart"/>
             <w:r>
               <w:rPr>
                 <w:rFonts w:ascii="Cambria" w:eastAsia="Cambria" w:hAnsi="Cambria" w:cs="Cambria"/>
                 <w:lang w:val="en-US"/>
               </w:rPr>
-              <w:t>Identificador</w:t>
-            </w:r>
-            <w:proofErr w:type="spellEnd"/>
-            <w:r>
-              <w:rPr>
-                <w:rFonts w:ascii="Cambria" w:eastAsia="Cambria" w:hAnsi="Cambria" w:cs="Cambria"/>
-                <w:lang w:val="en-US"/>
-              </w:rPr>
-              <w:t xml:space="preserve"> del </w:t>
+              <w:t xml:space="preserve">Identificador del </w:t>
             </w:r>
             <w:r>
               <w:rPr>
@@ -18374,7 +17418,6 @@
                 <w:color w:val="000000"/>
               </w:rPr>
             </w:pPr>
-            <w:proofErr w:type="spellStart"/>
             <w:r>
               <w:rPr>
                 <w:color w:val="000000" w:themeColor="text1"/>
@@ -18382,7 +17425,6 @@
               </w:rPr>
               <w:t>id_especie</w:t>
             </w:r>
-            <w:proofErr w:type="spellEnd"/>
           </w:p>
         </w:tc>
         <w:tc>
@@ -18405,21 +17447,12 @@
             <w:pPr>
               <w:jc w:val="both"/>
             </w:pPr>
-            <w:proofErr w:type="spellStart"/>
             <w:r>
               <w:rPr>
                 <w:rFonts w:ascii="Cambria" w:eastAsia="Cambria" w:hAnsi="Cambria" w:cs="Cambria"/>
                 <w:lang w:val="en-US"/>
               </w:rPr>
-              <w:t>Identificador</w:t>
-            </w:r>
-            <w:proofErr w:type="spellEnd"/>
-            <w:r>
-              <w:rPr>
-                <w:rFonts w:ascii="Cambria" w:eastAsia="Cambria" w:hAnsi="Cambria" w:cs="Cambria"/>
-                <w:lang w:val="en-US"/>
-              </w:rPr>
-              <w:t xml:space="preserve"> de la especie</w:t>
+              <w:t>Identificador de la especie</w:t>
             </w:r>
           </w:p>
         </w:tc>
@@ -18447,7 +17480,6 @@
                 <w:lang w:val="es-ES"/>
               </w:rPr>
             </w:pPr>
-            <w:proofErr w:type="spellStart"/>
             <w:r>
               <w:rPr>
                 <w:color w:val="000000" w:themeColor="text1"/>
@@ -18461,7 +17493,6 @@
               </w:rPr>
               <w:t>ecie</w:t>
             </w:r>
-            <w:proofErr w:type="spellEnd"/>
           </w:p>
         </w:tc>
       </w:tr>
@@ -18514,7 +17545,6 @@
             <w:pPr>
               <w:jc w:val="both"/>
             </w:pPr>
-            <w:proofErr w:type="spellStart"/>
             <w:r>
               <w:rPr>
                 <w:rFonts w:ascii="Cambria" w:eastAsia="Cambria" w:hAnsi="Cambria" w:cs="Cambria"/>
@@ -18522,7 +17552,6 @@
               </w:rPr>
               <w:t>fecha_registro</w:t>
             </w:r>
-            <w:proofErr w:type="spellEnd"/>
           </w:p>
         </w:tc>
         <w:tc>
@@ -19199,7 +18228,6 @@
                 <w:lang w:val="es-ES"/>
               </w:rPr>
             </w:pPr>
-            <w:proofErr w:type="spellStart"/>
             <w:r>
               <w:rPr>
                 <w:lang w:val="es-ES"/>
@@ -19218,7 +18246,6 @@
               </w:rPr>
               <w:t>guias</w:t>
             </w:r>
-            <w:proofErr w:type="spellEnd"/>
           </w:p>
         </w:tc>
         <w:tc>
@@ -19241,7 +18268,6 @@
             <w:pPr>
               <w:jc w:val="both"/>
             </w:pPr>
-            <w:proofErr w:type="spellStart"/>
             <w:r>
               <w:rPr>
                 <w:lang w:val="es-ES"/>
@@ -19249,11 +18275,7 @@
               <w:t>Identifi</w:t>
             </w:r>
             <w:r>
-              <w:t>cador</w:t>
-            </w:r>
-            <w:proofErr w:type="spellEnd"/>
-            <w:r>
-              <w:t xml:space="preserve"> de los guías</w:t>
+              <w:t>cador de los guías</w:t>
             </w:r>
           </w:p>
         </w:tc>
@@ -19335,14 +18357,12 @@
             <w:pPr>
               <w:jc w:val="both"/>
             </w:pPr>
-            <w:proofErr w:type="spellStart"/>
             <w:r>
               <w:rPr>
                 <w:lang w:val="es-ES"/>
               </w:rPr>
               <w:t>id_itiner</w:t>
             </w:r>
-            <w:proofErr w:type="spellEnd"/>
             <w:r>
               <w:t>ario</w:t>
             </w:r>
@@ -19494,14 +18514,12 @@
             <w:r>
               <w:t>F</w:t>
             </w:r>
-            <w:proofErr w:type="spellStart"/>
             <w:r>
               <w:rPr>
                 <w:lang w:val="es-ES"/>
               </w:rPr>
               <w:t>ech</w:t>
             </w:r>
-            <w:proofErr w:type="spellEnd"/>
             <w:r>
               <w:t>a de la asignación del guía al itinerario</w:t>
             </w:r>
@@ -19576,7 +18594,6 @@
             <w:pPr>
               <w:jc w:val="both"/>
             </w:pPr>
-            <w:proofErr w:type="spellStart"/>
             <w:r>
               <w:rPr>
                 <w:lang w:val="es-ES"/>
@@ -19586,7 +18603,6 @@
             <w:r>
               <w:t>cio</w:t>
             </w:r>
-            <w:proofErr w:type="spellEnd"/>
           </w:p>
         </w:tc>
         <w:tc>
@@ -19894,7 +18910,6 @@
                 <w:lang w:val="es-ES"/>
               </w:rPr>
             </w:pPr>
-            <w:proofErr w:type="spellStart"/>
             <w:r>
               <w:rPr>
                 <w:sz w:val="24"/>
@@ -19910,7 +18925,6 @@
               </w:rPr>
               <w:t>erinario</w:t>
             </w:r>
-            <w:proofErr w:type="spellEnd"/>
           </w:p>
           <w:p>
             <w:pPr>
@@ -20198,7 +19212,6 @@
             <w:pPr>
               <w:jc w:val="both"/>
             </w:pPr>
-            <w:proofErr w:type="spellStart"/>
             <w:r>
               <w:rPr>
                 <w:lang w:val="es-ES"/>
@@ -20208,7 +19221,6 @@
             <w:r>
               <w:t>inario</w:t>
             </w:r>
-            <w:proofErr w:type="spellEnd"/>
           </w:p>
         </w:tc>
         <w:tc>
@@ -20231,7 +19243,6 @@
             <w:pPr>
               <w:jc w:val="both"/>
             </w:pPr>
-            <w:proofErr w:type="spellStart"/>
             <w:r>
               <w:rPr>
                 <w:lang w:val="es-ES"/>
@@ -20239,11 +19250,7 @@
               <w:t>Iden</w:t>
             </w:r>
             <w:r>
-              <w:t>tificador</w:t>
-            </w:r>
-            <w:proofErr w:type="spellEnd"/>
-            <w:r>
-              <w:t xml:space="preserve"> del veterinario</w:t>
+              <w:t>tificador del veterinario</w:t>
             </w:r>
           </w:p>
         </w:tc>
@@ -20267,7 +19274,6 @@
             <w:pPr>
               <w:jc w:val="both"/>
             </w:pPr>
-            <w:proofErr w:type="spellStart"/>
             <w:r>
               <w:rPr>
                 <w:lang w:val="es-ES"/>
@@ -20277,7 +19283,6 @@
             <w:r>
               <w:t>io</w:t>
             </w:r>
-            <w:proofErr w:type="spellEnd"/>
           </w:p>
         </w:tc>
       </w:tr>
@@ -20327,14 +19332,12 @@
             <w:pPr>
               <w:jc w:val="both"/>
             </w:pPr>
-            <w:proofErr w:type="spellStart"/>
             <w:r>
               <w:rPr>
                 <w:lang w:val="es-ES"/>
               </w:rPr>
               <w:t>id_animal</w:t>
             </w:r>
-            <w:proofErr w:type="spellEnd"/>
           </w:p>
         </w:tc>
         <w:tc>
@@ -20357,7 +19360,6 @@
             <w:pPr>
               <w:jc w:val="both"/>
             </w:pPr>
-            <w:proofErr w:type="spellStart"/>
             <w:r>
               <w:rPr>
                 <w:lang w:val="es-ES"/>
@@ -20365,11 +19367,7 @@
               <w:t>Identi</w:t>
             </w:r>
             <w:r>
-              <w:t>ficador</w:t>
-            </w:r>
-            <w:proofErr w:type="spellEnd"/>
-            <w:r>
-              <w:t xml:space="preserve"> del animal</w:t>
+              <w:t>ficador del animal</w:t>
             </w:r>
           </w:p>
         </w:tc>
@@ -20393,14 +19391,12 @@
             <w:pPr>
               <w:jc w:val="both"/>
             </w:pPr>
-            <w:proofErr w:type="spellStart"/>
             <w:r>
               <w:rPr>
                 <w:lang w:val="es-ES"/>
               </w:rPr>
               <w:t>anim</w:t>
             </w:r>
-            <w:proofErr w:type="spellEnd"/>
             <w:r>
               <w:t>al</w:t>
             </w:r>
@@ -20453,7 +19449,6 @@
             <w:pPr>
               <w:jc w:val="both"/>
             </w:pPr>
-            <w:proofErr w:type="spellStart"/>
             <w:r>
               <w:rPr>
                 <w:lang w:val="es-ES"/>
@@ -20463,7 +19458,6 @@
             <w:r>
               <w:t>ncion</w:t>
             </w:r>
-            <w:proofErr w:type="spellEnd"/>
           </w:p>
         </w:tc>
         <w:tc>
@@ -20581,14 +19575,12 @@
                 <w:lang w:val="es-ES"/>
               </w:rPr>
             </w:pPr>
-            <w:proofErr w:type="spellStart"/>
             <w:r>
               <w:rPr>
                 <w:lang w:val="es-ES"/>
               </w:rPr>
               <w:t>diagnos</w:t>
             </w:r>
-            <w:proofErr w:type="spellEnd"/>
             <w:r>
               <w:t>tico</w:t>
             </w:r>
@@ -20751,13 +19743,8 @@
               </w:rPr>
               <w:t>Cuida</w:t>
             </w:r>
-            <w:proofErr w:type="spellStart"/>
-            <w:r>
-              <w:t>dor</w:t>
-            </w:r>
-            <w:proofErr w:type="spellEnd"/>
-            <w:r>
-              <w:t xml:space="preserve"> - especie</w:t>
+            <w:r>
+              <w:t>dor - especie</w:t>
             </w:r>
           </w:p>
         </w:tc>
@@ -20818,14 +19805,12 @@
               <w:spacing w:after="0"/>
               <w:jc w:val="center"/>
             </w:pPr>
-            <w:proofErr w:type="spellStart"/>
             <w:r>
               <w:rPr>
                 <w:lang w:val="es-ES"/>
               </w:rPr>
               <w:t>Cuid</w:t>
             </w:r>
-            <w:proofErr w:type="spellEnd"/>
             <w:r>
               <w:t>ador</w:t>
             </w:r>
@@ -21086,14 +20071,12 @@
             <w:pPr>
               <w:spacing w:after="0"/>
             </w:pPr>
-            <w:proofErr w:type="spellStart"/>
             <w:r>
               <w:rPr>
                 <w:lang w:val="es-ES"/>
               </w:rPr>
               <w:t>Id_cuidador</w:t>
             </w:r>
-            <w:proofErr w:type="spellEnd"/>
           </w:p>
         </w:tc>
         <w:tc>
@@ -21114,7 +20097,6 @@
             <w:pPr>
               <w:spacing w:after="0"/>
             </w:pPr>
-            <w:proofErr w:type="spellStart"/>
             <w:r>
               <w:rPr>
                 <w:lang w:val="es-ES"/>
@@ -21122,11 +20104,7 @@
               <w:t>Ident</w:t>
             </w:r>
             <w:r>
-              <w:t>ificador</w:t>
-            </w:r>
-            <w:proofErr w:type="spellEnd"/>
-            <w:r>
-              <w:t xml:space="preserve"> del cuidador</w:t>
+              <w:t>ificador del cuidador</w:t>
             </w:r>
           </w:p>
         </w:tc>
@@ -21206,14 +20184,12 @@
             <w:pPr>
               <w:spacing w:after="0"/>
             </w:pPr>
-            <w:proofErr w:type="spellStart"/>
             <w:r>
               <w:rPr>
                 <w:lang w:val="es-ES"/>
               </w:rPr>
               <w:t>Id_especies</w:t>
             </w:r>
-            <w:proofErr w:type="spellEnd"/>
           </w:p>
         </w:tc>
         <w:tc>
@@ -21234,7 +20210,6 @@
             <w:pPr>
               <w:spacing w:after="0"/>
             </w:pPr>
-            <w:proofErr w:type="spellStart"/>
             <w:r>
               <w:rPr>
                 <w:lang w:val="es-ES"/>
@@ -21242,11 +20217,7 @@
               <w:t>Identi</w:t>
             </w:r>
             <w:r>
-              <w:t>ficador</w:t>
-            </w:r>
-            <w:proofErr w:type="spellEnd"/>
-            <w:r>
-              <w:t xml:space="preserve"> de la especie</w:t>
+              <w:t>ficador de la especie</w:t>
             </w:r>
           </w:p>
         </w:tc>
@@ -21268,7 +20239,6 @@
             <w:pPr>
               <w:spacing w:after="0"/>
             </w:pPr>
-            <w:proofErr w:type="spellStart"/>
             <w:r>
               <w:rPr>
                 <w:lang w:val="es-ES"/>
@@ -21278,7 +20248,6 @@
             <w:r>
               <w:t>ie</w:t>
             </w:r>
-            <w:proofErr w:type="spellEnd"/>
           </w:p>
         </w:tc>
       </w:tr>
@@ -21328,7 +20297,6 @@
             <w:pPr>
               <w:spacing w:after="0"/>
             </w:pPr>
-            <w:proofErr w:type="spellStart"/>
             <w:r>
               <w:rPr>
                 <w:lang w:val="es-ES"/>
@@ -21336,11 +20304,7 @@
               <w:t>Fecha_asigna</w:t>
             </w:r>
             <w:r>
-              <w:t>cion</w:t>
-            </w:r>
-            <w:proofErr w:type="spellEnd"/>
-            <w:r>
-              <w:t xml:space="preserve"> </w:t>
+              <w:t xml:space="preserve">cion </w:t>
             </w:r>
           </w:p>
         </w:tc>
@@ -21476,14 +20440,12 @@
             <w:r>
               <w:t>V</w:t>
             </w:r>
-            <w:proofErr w:type="spellStart"/>
             <w:r>
               <w:rPr>
                 <w:lang w:val="es-ES"/>
               </w:rPr>
               <w:t>isit</w:t>
             </w:r>
-            <w:proofErr w:type="spellEnd"/>
             <w:r>
               <w:t>ante</w:t>
             </w:r>
@@ -21558,14 +20520,12 @@
               <w:spacing w:after="0"/>
               <w:jc w:val="center"/>
             </w:pPr>
-            <w:proofErr w:type="spellStart"/>
             <w:r>
               <w:rPr>
                 <w:lang w:val="es-ES"/>
               </w:rPr>
               <w:t>Visi</w:t>
             </w:r>
-            <w:proofErr w:type="spellEnd"/>
             <w:r>
               <w:t>tante</w:t>
             </w:r>
@@ -21578,7 +20538,6 @@
                 <w:lang w:val="es-ES"/>
               </w:rPr>
             </w:pPr>
-            <w:proofErr w:type="spellStart"/>
             <w:r>
               <w:rPr>
                 <w:lang w:val="es-ES"/>
@@ -21588,7 +20547,6 @@
             <w:r>
               <w:t>rario</w:t>
             </w:r>
-            <w:proofErr w:type="spellEnd"/>
           </w:p>
         </w:tc>
       </w:tr>
@@ -21837,7 +20795,6 @@
             <w:pPr>
               <w:spacing w:after="0"/>
             </w:pPr>
-            <w:proofErr w:type="spellStart"/>
             <w:r>
               <w:rPr>
                 <w:rFonts w:ascii="Cambria" w:eastAsia="Cambria" w:hAnsi="Cambria" w:cs="Cambria"/>
@@ -21845,7 +20802,6 @@
               </w:rPr>
               <w:t>id_visitante</w:t>
             </w:r>
-            <w:proofErr w:type="spellEnd"/>
           </w:p>
         </w:tc>
         <w:tc>
@@ -21866,7 +20822,6 @@
             <w:pPr>
               <w:spacing w:after="0"/>
             </w:pPr>
-            <w:proofErr w:type="spellStart"/>
             <w:r>
               <w:rPr>
                 <w:lang w:val="es-ES"/>
@@ -21874,11 +20829,7 @@
               <w:t>Ident</w:t>
             </w:r>
             <w:r>
-              <w:t>ificador</w:t>
-            </w:r>
-            <w:proofErr w:type="spellEnd"/>
-            <w:r>
-              <w:t xml:space="preserve"> del visitante</w:t>
+              <w:t>ificador del visitante</w:t>
             </w:r>
           </w:p>
         </w:tc>
@@ -21955,7 +20906,6 @@
             <w:pPr>
               <w:spacing w:after="0"/>
             </w:pPr>
-            <w:proofErr w:type="spellStart"/>
             <w:r>
               <w:rPr>
                 <w:rFonts w:ascii="Cambria" w:eastAsia="Cambria" w:hAnsi="Cambria" w:cs="Cambria"/>
@@ -21963,7 +20913,6 @@
               </w:rPr>
               <w:t>id_itinerario</w:t>
             </w:r>
-            <w:proofErr w:type="spellEnd"/>
           </w:p>
         </w:tc>
         <w:tc>
@@ -21984,7 +20933,6 @@
             <w:pPr>
               <w:spacing w:after="0"/>
             </w:pPr>
-            <w:proofErr w:type="spellStart"/>
             <w:r>
               <w:rPr>
                 <w:lang w:val="es-ES"/>
@@ -21992,11 +20940,7 @@
               <w:t>Ident</w:t>
             </w:r>
             <w:r>
-              <w:t>ificador</w:t>
-            </w:r>
-            <w:proofErr w:type="spellEnd"/>
-            <w:r>
-              <w:t xml:space="preserve"> del itinerario</w:t>
+              <w:t>ificador del itinerario</w:t>
             </w:r>
           </w:p>
         </w:tc>
@@ -22024,11 +20968,9 @@
               </w:rPr>
               <w:t>it</w:t>
             </w:r>
-            <w:proofErr w:type="spellStart"/>
             <w:r>
               <w:t>inerario</w:t>
             </w:r>
-            <w:proofErr w:type="spellEnd"/>
           </w:p>
         </w:tc>
       </w:tr>
@@ -22078,7 +21020,6 @@
             <w:pPr>
               <w:spacing w:after="0"/>
             </w:pPr>
-            <w:proofErr w:type="spellStart"/>
             <w:r>
               <w:rPr>
                 <w:rFonts w:ascii="Cambria" w:eastAsia="Cambria" w:hAnsi="Cambria" w:cs="Cambria"/>
@@ -22086,7 +21027,6 @@
               </w:rPr>
               <w:t>fecha_reserva</w:t>
             </w:r>
-            <w:proofErr w:type="spellEnd"/>
           </w:p>
         </w:tc>
         <w:tc>
@@ -22110,24 +21050,14 @@
             <w:r>
               <w:t>F</w:t>
             </w:r>
-            <w:proofErr w:type="spellStart"/>
             <w:r>
               <w:rPr>
                 <w:lang w:val="es-ES"/>
               </w:rPr>
               <w:t>ech</w:t>
             </w:r>
-            <w:proofErr w:type="spellEnd"/>
-            <w:r>
-              <w:t xml:space="preserve">a en la que se </w:t>
-            </w:r>
-            <w:proofErr w:type="spellStart"/>
-            <w:r>
-              <w:t>reservo</w:t>
-            </w:r>
-            <w:proofErr w:type="spellEnd"/>
-            <w:r>
-              <w:t xml:space="preserve"> el itinerario</w:t>
+            <w:r>
+              <w:t>a en la que se reservo el itinerario</w:t>
             </w:r>
           </w:p>
         </w:tc>
@@ -22279,21 +21209,12 @@
               <w:spacing w:after="0"/>
               <w:jc w:val="center"/>
             </w:pPr>
-            <w:proofErr w:type="spellStart"/>
             <w:r>
               <w:rPr>
                 <w:rFonts w:ascii="Cambria" w:eastAsia="Cambria" w:hAnsi="Cambria" w:cs="Cambria"/>
                 <w:lang w:val="en-US"/>
               </w:rPr>
-              <w:t>Itinerarios</w:t>
-            </w:r>
-            <w:proofErr w:type="spellEnd"/>
-            <w:r>
-              <w:rPr>
-                <w:rFonts w:ascii="Cambria" w:eastAsia="Cambria" w:hAnsi="Cambria" w:cs="Cambria"/>
-                <w:lang w:val="en-US"/>
-              </w:rPr>
-              <w:t xml:space="preserve"> – Zonas</w:t>
+              <w:t>Itinerarios – Zonas</w:t>
             </w:r>
           </w:p>
         </w:tc>
@@ -22372,7 +21293,6 @@
                 <w:lang w:val="es-ES"/>
               </w:rPr>
             </w:pPr>
-            <w:proofErr w:type="spellStart"/>
             <w:r>
               <w:rPr>
                 <w:lang w:val="es-ES"/>
@@ -22382,7 +21302,6 @@
             <w:r>
               <w:t>rario</w:t>
             </w:r>
-            <w:proofErr w:type="spellEnd"/>
           </w:p>
         </w:tc>
       </w:tr>
@@ -22635,7 +21554,6 @@
                 <w:lang w:val="en-US"/>
               </w:rPr>
             </w:pPr>
-            <w:proofErr w:type="spellStart"/>
             <w:r>
               <w:rPr>
                 <w:rFonts w:ascii="Cambria" w:eastAsia="Cambria" w:hAnsi="Cambria" w:cs="Cambria"/>
@@ -22643,7 +21561,6 @@
               </w:rPr>
               <w:t>id_zona</w:t>
             </w:r>
-            <w:proofErr w:type="spellEnd"/>
           </w:p>
         </w:tc>
         <w:tc>
@@ -22664,7 +21581,6 @@
             <w:pPr>
               <w:spacing w:after="0"/>
             </w:pPr>
-            <w:proofErr w:type="spellStart"/>
             <w:r>
               <w:rPr>
                 <w:lang w:val="es-ES"/>
@@ -22672,11 +21588,7 @@
               <w:t>Ident</w:t>
             </w:r>
             <w:r>
-              <w:t>ificador</w:t>
-            </w:r>
-            <w:proofErr w:type="spellEnd"/>
-            <w:r>
-              <w:t xml:space="preserve"> de la zona</w:t>
+              <w:t>ificador de la zona</w:t>
             </w:r>
           </w:p>
         </w:tc>
@@ -22760,7 +21672,6 @@
                 <w:lang w:val="en-US"/>
               </w:rPr>
             </w:pPr>
-            <w:proofErr w:type="spellStart"/>
             <w:r>
               <w:rPr>
                 <w:rFonts w:ascii="Cambria" w:eastAsia="Cambria" w:hAnsi="Cambria" w:cs="Cambria"/>
@@ -22768,7 +21679,6 @@
               </w:rPr>
               <w:t>id_itinerario</w:t>
             </w:r>
-            <w:proofErr w:type="spellEnd"/>
           </w:p>
         </w:tc>
         <w:tc>
@@ -22789,7 +21699,6 @@
             <w:pPr>
               <w:spacing w:after="0"/>
             </w:pPr>
-            <w:proofErr w:type="spellStart"/>
             <w:r>
               <w:rPr>
                 <w:lang w:val="es-ES"/>
@@ -22797,11 +21706,7 @@
               <w:t>Ident</w:t>
             </w:r>
             <w:r>
-              <w:t>ificador</w:t>
-            </w:r>
-            <w:proofErr w:type="spellEnd"/>
-            <w:r>
-              <w:t xml:space="preserve"> del itinerario</w:t>
+              <w:t>ificador del itinerario</w:t>
             </w:r>
           </w:p>
         </w:tc>
@@ -22829,11 +21734,9 @@
               </w:rPr>
               <w:t>it</w:t>
             </w:r>
-            <w:proofErr w:type="spellStart"/>
             <w:r>
               <w:t>inerario</w:t>
             </w:r>
-            <w:proofErr w:type="spellEnd"/>
           </w:p>
         </w:tc>
       </w:tr>
@@ -22887,7 +21790,6 @@
                 <w:lang w:val="en-US"/>
               </w:rPr>
             </w:pPr>
-            <w:proofErr w:type="spellStart"/>
             <w:r>
               <w:rPr>
                 <w:rFonts w:ascii="Cambria" w:eastAsia="Cambria" w:hAnsi="Cambria" w:cs="Cambria"/>
@@ -22895,7 +21797,6 @@
               </w:rPr>
               <w:t>orden_rrecorido</w:t>
             </w:r>
-            <w:proofErr w:type="spellEnd"/>
           </w:p>
         </w:tc>
         <w:tc>
@@ -23375,7 +22276,6 @@
                 <w:lang w:val="en-US"/>
               </w:rPr>
             </w:pPr>
-            <w:proofErr w:type="spellStart"/>
             <w:r>
               <w:rPr>
                 <w:rFonts w:ascii="Cambria" w:eastAsia="Cambria" w:hAnsi="Cambria" w:cs="Cambria"/>
@@ -23390,7 +22290,6 @@
               </w:rPr>
               <w:t>especie</w:t>
             </w:r>
-            <w:proofErr w:type="spellEnd"/>
           </w:p>
         </w:tc>
         <w:tc>
@@ -23411,7 +22310,6 @@
             <w:pPr>
               <w:spacing w:after="0"/>
             </w:pPr>
-            <w:proofErr w:type="spellStart"/>
             <w:r>
               <w:rPr>
                 <w:lang w:val="es-ES"/>
@@ -23419,11 +22317,7 @@
               <w:t>Ident</w:t>
             </w:r>
             <w:r>
-              <w:t>ificador</w:t>
-            </w:r>
-            <w:proofErr w:type="spellEnd"/>
-            <w:r>
-              <w:t xml:space="preserve"> de las especies</w:t>
+              <w:t>ificador de las especies</w:t>
             </w:r>
           </w:p>
         </w:tc>
@@ -23507,7 +22401,6 @@
                 <w:lang w:val="en-US"/>
               </w:rPr>
             </w:pPr>
-            <w:proofErr w:type="spellStart"/>
             <w:r>
               <w:rPr>
                 <w:rFonts w:ascii="Cambria" w:eastAsia="Cambria" w:hAnsi="Cambria" w:cs="Cambria"/>
@@ -23522,7 +22415,6 @@
               </w:rPr>
               <w:t>alimento</w:t>
             </w:r>
-            <w:proofErr w:type="spellEnd"/>
           </w:p>
         </w:tc>
         <w:tc>
@@ -23543,7 +22435,6 @@
             <w:pPr>
               <w:spacing w:after="0"/>
             </w:pPr>
-            <w:proofErr w:type="spellStart"/>
             <w:r>
               <w:rPr>
                 <w:lang w:val="es-ES"/>
@@ -23551,11 +22442,7 @@
               <w:t>Ident</w:t>
             </w:r>
             <w:r>
-              <w:t>ificador</w:t>
-            </w:r>
-            <w:proofErr w:type="spellEnd"/>
-            <w:r>
-              <w:t xml:space="preserve"> del tipo de alimento</w:t>
+              <w:t>ificador del tipo de alimento</w:t>
             </w:r>
           </w:p>
         </w:tc>
@@ -23577,14 +22464,12 @@
             <w:pPr>
               <w:spacing w:after="0"/>
             </w:pPr>
-            <w:proofErr w:type="spellStart"/>
             <w:r>
               <w:rPr>
                 <w:lang w:val="es-ES"/>
               </w:rPr>
               <w:t>Alimentacion</w:t>
             </w:r>
-            <w:proofErr w:type="spellEnd"/>
           </w:p>
         </w:tc>
       </w:tr>
@@ -23835,7 +22720,6 @@
           <w:lang w:val="es-ES"/>
         </w:rPr>
       </w:pPr>
-      <w:proofErr w:type="spellStart"/>
       <w:r>
         <w:rPr>
           <w:b/>
@@ -23845,7 +22729,6 @@
         </w:rPr>
         <w:t>Tips</w:t>
       </w:r>
-      <w:proofErr w:type="spellEnd"/>
     </w:p>
     <w:p>
       <w:pPr>
@@ -24023,29 +22906,7 @@
           <w:szCs w:val="24"/>
           <w:lang w:val="es-ES"/>
         </w:rPr>
-        <w:t xml:space="preserve">Modelo </w:t>
-      </w:r>
-      <w:proofErr w:type="gramStart"/>
-      <w:r>
-        <w:rPr>
-          <w:b/>
-          <w:color w:val="000000" w:themeColor="text1"/>
-          <w:sz w:val="24"/>
-          <w:szCs w:val="24"/>
-          <w:lang w:val="es-ES"/>
-        </w:rPr>
-        <w:t>Conceptual  -</w:t>
-      </w:r>
-      <w:proofErr w:type="gramEnd"/>
-      <w:r>
-        <w:rPr>
-          <w:b/>
-          <w:color w:val="000000" w:themeColor="text1"/>
-          <w:sz w:val="24"/>
-          <w:szCs w:val="24"/>
-          <w:lang w:val="es-ES"/>
-        </w:rPr>
-        <w:t xml:space="preserve"> Diagrama E-</w:t>
+        <w:t>Modelo Conceptual  - Diagrama E-</w:t>
       </w:r>
       <w:r>
         <w:rPr>
@@ -25318,19 +24179,8 @@
           <w:highlight w:val="white"/>
           <w:lang w:val="es-ES"/>
         </w:rPr>
-        <w:t xml:space="preserve"> diagrama de </w:t>
-      </w:r>
-      <w:proofErr w:type="spellStart"/>
-      <w:r>
-        <w:rPr>
-          <w:sz w:val="24"/>
-          <w:szCs w:val="24"/>
-          <w:highlight w:val="white"/>
-          <w:lang w:val="es-ES"/>
-        </w:rPr>
-        <w:t>chen</w:t>
-      </w:r>
-      <w:proofErr w:type="spellEnd"/>
+        <w:t xml:space="preserve"> diagrama de chen</w:t>
+      </w:r>
       <w:r>
         <w:rPr>
           <w:sz w:val="24"/>
@@ -25578,29 +24428,7 @@
           <w:highlight w:val="white"/>
           <w:lang w:val="es-ES"/>
         </w:rPr>
-        <w:t xml:space="preserve">Ítem 11: Repositorio Git </w:t>
-      </w:r>
-      <w:proofErr w:type="spellStart"/>
-      <w:r>
-        <w:rPr>
-          <w:b/>
-          <w:sz w:val="24"/>
-          <w:szCs w:val="24"/>
-          <w:highlight w:val="white"/>
-          <w:lang w:val="es-ES"/>
-        </w:rPr>
-        <w:t>Labo</w:t>
-      </w:r>
-      <w:proofErr w:type="spellEnd"/>
-      <w:r>
-        <w:rPr>
-          <w:b/>
-          <w:sz w:val="24"/>
-          <w:szCs w:val="24"/>
-          <w:highlight w:val="white"/>
-          <w:lang w:val="es-ES"/>
-        </w:rPr>
-        <w:t xml:space="preserve"> GitHub</w:t>
+        <w:t>Ítem 11: Repositorio Git Labo GitHub</w:t>
       </w:r>
     </w:p>
     <w:p>
@@ -25689,27 +24517,7 @@
           <w:highlight w:val="white"/>
           <w:lang w:val="es-ES"/>
         </w:rPr>
-        <w:t xml:space="preserve">El repositorio </w:t>
-      </w:r>
-      <w:proofErr w:type="gramStart"/>
-      <w:r>
-        <w:rPr>
-          <w:sz w:val="24"/>
-          <w:szCs w:val="24"/>
-          <w:highlight w:val="white"/>
-          <w:lang w:val="es-ES"/>
-        </w:rPr>
-        <w:t>tiene que tener</w:t>
-      </w:r>
-      <w:proofErr w:type="gramEnd"/>
-      <w:r>
-        <w:rPr>
-          <w:sz w:val="24"/>
-          <w:szCs w:val="24"/>
-          <w:highlight w:val="white"/>
-          <w:lang w:val="es-ES"/>
-        </w:rPr>
-        <w:t xml:space="preserve"> la descripción, el propósito y los miembros del equipo de estudiantes. </w:t>
+        <w:t xml:space="preserve">El repositorio tiene que tener la descripción, el propósito y los miembros del equipo de estudiantes. </w:t>
       </w:r>
     </w:p>
     <w:p>
@@ -28655,21 +27463,7 @@
         <w:rPr>
           <w:lang w:val="es-ES"/>
         </w:rPr>
-        <w:t>Paciente (</w:t>
-      </w:r>
-      <w:proofErr w:type="spellStart"/>
-      <w:r>
-        <w:rPr>
-          <w:lang w:val="es-ES"/>
-        </w:rPr>
-        <w:t>ID_Paciente</w:t>
-      </w:r>
-      <w:proofErr w:type="spellEnd"/>
-      <w:r>
-        <w:rPr>
-          <w:lang w:val="es-ES"/>
-        </w:rPr>
-        <w:t>, Nombre, Edad, Dirección)</w:t>
+        <w:t>Paciente (ID_Paciente, Nombre, Edad, Dirección)</w:t>
       </w:r>
     </w:p>
     <w:p>
@@ -28691,21 +27485,7 @@
         <w:rPr>
           <w:lang w:val="es-ES"/>
         </w:rPr>
-        <w:t xml:space="preserve">El </w:t>
-      </w:r>
-      <w:proofErr w:type="spellStart"/>
-      <w:r>
-        <w:rPr>
-          <w:lang w:val="es-ES"/>
-        </w:rPr>
-        <w:t>ID_Paciente</w:t>
-      </w:r>
-      <w:proofErr w:type="spellEnd"/>
-      <w:r>
-        <w:rPr>
-          <w:lang w:val="es-ES"/>
-        </w:rPr>
-        <w:t xml:space="preserve"> es suficiente para identificar a cada paciente sin necesidad de otra entidad.</w:t>
+        <w:t>El ID_Paciente es suficiente para identificar a cada paciente sin necesidad de otra entidad.</w:t>
       </w:r>
     </w:p>
     <w:p>
@@ -28871,35 +27651,7 @@
         <w:rPr>
           <w:lang w:val="es-ES"/>
         </w:rPr>
-        <w:t>Su relación con la entidad fuerte es normalmente de dependencia (</w:t>
-      </w:r>
-      <w:proofErr w:type="spellStart"/>
-      <w:r>
-        <w:rPr>
-          <w:lang w:val="es-ES"/>
-        </w:rPr>
-        <w:t>identifying</w:t>
-      </w:r>
-      <w:proofErr w:type="spellEnd"/>
-      <w:r>
-        <w:rPr>
-          <w:lang w:val="es-ES"/>
-        </w:rPr>
-        <w:t xml:space="preserve"> </w:t>
-      </w:r>
-      <w:proofErr w:type="spellStart"/>
-      <w:r>
-        <w:rPr>
-          <w:lang w:val="es-ES"/>
-        </w:rPr>
-        <w:t>relationship</w:t>
-      </w:r>
-      <w:proofErr w:type="spellEnd"/>
-      <w:r>
-        <w:rPr>
-          <w:lang w:val="es-ES"/>
-        </w:rPr>
-        <w:t>).</w:t>
+        <w:t>Su relación con la entidad fuerte es normalmente de dependencia (identifying relationship).</w:t>
       </w:r>
     </w:p>
     <w:p>
@@ -28946,35 +27698,7 @@
         <w:rPr>
           <w:lang w:val="es-ES"/>
         </w:rPr>
-        <w:t>Consulta (</w:t>
-      </w:r>
-      <w:proofErr w:type="spellStart"/>
-      <w:r>
-        <w:rPr>
-          <w:lang w:val="es-ES"/>
-        </w:rPr>
-        <w:t>NroConsulta</w:t>
-      </w:r>
-      <w:proofErr w:type="spellEnd"/>
-      <w:r>
-        <w:rPr>
-          <w:lang w:val="es-ES"/>
-        </w:rPr>
-        <w:t xml:space="preserve">, Fecha, </w:t>
-      </w:r>
-      <w:proofErr w:type="spellStart"/>
-      <w:r>
-        <w:rPr>
-          <w:lang w:val="es-ES"/>
-        </w:rPr>
-        <w:t>ID_Paciente</w:t>
-      </w:r>
-      <w:proofErr w:type="spellEnd"/>
-      <w:r>
-        <w:rPr>
-          <w:lang w:val="es-ES"/>
-        </w:rPr>
-        <w:t>)</w:t>
+        <w:t>Consulta (NroConsulta, Fecha, ID_Paciente)</w:t>
       </w:r>
     </w:p>
     <w:p>
@@ -28996,21 +27720,7 @@
         <w:rPr>
           <w:lang w:val="es-ES"/>
         </w:rPr>
-        <w:t>El número de consulta (</w:t>
-      </w:r>
-      <w:proofErr w:type="spellStart"/>
-      <w:r>
-        <w:rPr>
-          <w:lang w:val="es-ES"/>
-        </w:rPr>
-        <w:t>NroConsulta</w:t>
-      </w:r>
-      <w:proofErr w:type="spellEnd"/>
-      <w:r>
-        <w:rPr>
-          <w:lang w:val="es-ES"/>
-        </w:rPr>
-        <w:t>) por sí solo no identifica de manera única una consulta, ya que puede repetirse entre diferentes pacientes.</w:t>
+        <w:t>El número de consulta (NroConsulta) por sí solo no identifica de manera única una consulta, ya que puede repetirse entre diferentes pacientes.</w:t>
       </w:r>
     </w:p>
     <w:p>
@@ -29032,35 +27742,7 @@
         <w:rPr>
           <w:lang w:val="es-ES"/>
         </w:rPr>
-        <w:t>La clave primaria compuesta sería (</w:t>
-      </w:r>
-      <w:proofErr w:type="spellStart"/>
-      <w:r>
-        <w:rPr>
-          <w:lang w:val="es-ES"/>
-        </w:rPr>
-        <w:t>ID_Paciente</w:t>
-      </w:r>
-      <w:proofErr w:type="spellEnd"/>
-      <w:r>
-        <w:rPr>
-          <w:lang w:val="es-ES"/>
-        </w:rPr>
-        <w:t xml:space="preserve"> + </w:t>
-      </w:r>
-      <w:proofErr w:type="spellStart"/>
-      <w:r>
-        <w:rPr>
-          <w:lang w:val="es-ES"/>
-        </w:rPr>
-        <w:t>NroConsulta</w:t>
-      </w:r>
-      <w:proofErr w:type="spellEnd"/>
-      <w:r>
-        <w:rPr>
-          <w:lang w:val="es-ES"/>
-        </w:rPr>
-        <w:t>).</w:t>
+        <w:t>La clave primaria compuesta sería (ID_Paciente + NroConsulta).</w:t>
       </w:r>
     </w:p>
     <w:p>
@@ -30416,6 +29098,30 @@
       </w:pPr>
     </w:p>
     <w:p/>
+    <w:p>
+      <w:pPr>
+        <w:rPr>
+          <w:b/>
+          <w:bCs/>
+          <w:sz w:val="32"/>
+          <w:szCs w:val="32"/>
+        </w:rPr>
+      </w:pPr>
+      <w:r>
+        <w:rPr>
+          <w:b/>
+          <w:bCs/>
+          <w:sz w:val="32"/>
+          <w:szCs w:val="32"/>
+        </w:rPr>
+        <w:t>ENLACE DEL VIDEO</w:t>
+      </w:r>
+    </w:p>
+    <w:p>
+      <w:r>
+        <w:t>https://drive.google.com/file/d/1_GcuAGRRr3nd7Ye_LCEAN2pM6meCDa9o/view?usp=drive_link</w:t>
+      </w:r>
+    </w:p>
     <w:sectPr>
       <w:footerReference w:type="default" r:id="rId34"/>
       <w:pgSz w:w="11906" w:h="16838"/>
@@ -35614,15 +34320,6 @@
 </file>
 
 <file path=customXml/item1.xml><?xml version="1.0" encoding="utf-8"?>
-<?mso-contentType ?>
-<FormTemplates xmlns="http://schemas.microsoft.com/sharepoint/v3/contenttype/forms">
-  <Display>DocumentLibraryForm</Display>
-  <Edit>DocumentLibraryForm</Edit>
-  <New>DocumentLibraryForm</New>
-</FormTemplates>
-</file>
-
-<file path=customXml/item2.xml><?xml version="1.0" encoding="utf-8"?>
 <ct:contentTypeSchema xmlns:ct="http://schemas.microsoft.com/office/2006/metadata/contentType" xmlns:ma="http://schemas.microsoft.com/office/2006/metadata/properties/metaAttributes" ct:_="" ma:_="" ma:contentTypeName="Documento" ma:contentTypeID="0x01010032CE308956FE214DB8556B13F4B7C129" ma:contentTypeVersion="10" ma:contentTypeDescription="Crear nuevo documento." ma:contentTypeScope="" ma:versionID="f8a1d75384fb91dfaac34653d83d81bc">
   <xsd:schema xmlns:xsd="http://www.w3.org/2001/XMLSchema" xmlns:xs="http://www.w3.org/2001/XMLSchema" xmlns:p="http://schemas.microsoft.com/office/2006/metadata/properties" xmlns:ns3="43f8cd5b-775c-45a5-b556-d0332f058a22" targetNamespace="http://schemas.microsoft.com/office/2006/metadata/properties" ma:root="true" ma:fieldsID="c2733301ad4deaa62a66738cc9332178" ns3:_="">
     <xsd:import namespace="43f8cd5b-775c-45a5-b556-d0332f058a22"/>
@@ -35804,115 +34501,16 @@
 </ct:contentTypeSchema>
 </file>
 
-<file path=customXml/item3.xml><?xml version="1.0" encoding="utf-8"?>
-<b:Sources xmlns:b="http://schemas.openxmlformats.org/officeDocument/2006/bibliography" xmlns="http://schemas.openxmlformats.org/officeDocument/2006/bibliography" SelectedStyle="\APASixthEditionOfficeOnline.xsl" StyleName="APA" Version="6">
-  <b:Source>
-    <b:Tag>Dib</b:Tag>
-    <b:SourceType>InternetSite</b:SourceType>
-    <b:Guid>{A129B543-C7F9-4057-BB8D-21C4F7CEC6FA}</b:Guid>
-    <b:Title>Dibujo conceptual</b:Title>
-    <b:URL>https://www.conceptdraw.com/How-To-Guide/idef1x</b:URL>
-    <b:RefOrder>3</b:RefOrder>
-  </b:Source>
-  <b:Source>
-    <b:Tag>Pro</b:Tag>
-    <b:SourceType>InternetSite</b:SourceType>
-    <b:Guid>{2FA4EB10-30FF-4220-B28C-0D930CEF2713}</b:Guid>
-    <b:LCID>es-CO</b:LCID>
-    <b:Title>Project Performance International</b:Title>
-    <b:URL>https://segoldmine.ppi-int.com/node/44269#:~:text=IDEF%20(Integration%20DEFinition)%20is%20a,Documents</b:URL>
-    <b:RefOrder>2</b:RefOrder>
-  </b:Source>
-  <b:Source>
-    <b:Tag>Ess</b:Tag>
-    <b:SourceType>InternetSite</b:SourceType>
-    <b:Guid>{3BA7A616-6D6B-4558-95A3-487095B8257F}</b:Guid>
-    <b:Title>Essential Strategies, Inc.</b:Title>
-    <b:URL>https://www.essentialstrategies.com/publications/modeling/idef1</b:URL>
-    <b:RefOrder>4</b:RefOrder>
-  </b:Source>
-  <b:Source>
-    <b:Tag>Wik25</b:Tag>
-    <b:SourceType>InternetSite</b:SourceType>
-    <b:Guid>{5E1780A9-018F-4E51-90C1-50DA52E1DDEB}</b:Guid>
-    <b:Title>Wikipedia The Free Encyclopedia</b:Title>
-    <b:Year>2025</b:Year>
-    <b:Month>Abril</b:Month>
-    <b:Day>27</b:Day>
-    <b:URL>https://en.wikipedia.org/wiki/IDEF1X?</b:URL>
-    <b:RefOrder>1</b:RefOrder>
-  </b:Source>
-  <b:Source>
-    <b:Tag>gee25</b:Tag>
-    <b:SourceType>InternetSite</b:SourceType>
-    <b:Guid>{DCF30AE4-8FD6-4B02-874A-3B8AF43FF14F}</b:Guid>
-    <b:Title>geeksforgeeks</b:Title>
-    <b:Year>2025</b:Year>
-    <b:Month>Julio</b:Month>
-    <b:Day>25</b:Day>
-    <b:URL>https://www.geeksforgeeks.org/dbms/structural-constraints-of-relationships-in-er-model/</b:URL>
-    <b:RefOrder>6</b:RefOrder>
-  </b:Source>
-  <b:Source>
-    <b:Tag>wik25</b:Tag>
-    <b:SourceType>InternetSite</b:SourceType>
-    <b:Guid>{58704EEB-315E-4DFB-A0B9-26B09DA18770}</b:Guid>
-    <b:Title>wikipedia</b:Title>
-    <b:Year>2025</b:Year>
-    <b:Month>febrero</b:Month>
-    <b:Day>21</b:Day>
-    <b:URL>https://de.wikipedia.org/wiki/Min-Max-Notation?</b:URL>
-    <b:RefOrder>5</b:RefOrder>
-  </b:Source>
-  <b:Source>
-    <b:Tag>mic21</b:Tag>
-    <b:SourceType>InternetSite</b:SourceType>
-    <b:Guid>{D70D8356-8FCF-477B-974C-35A7716BCC08}</b:Guid>
-    <b:Author>
-      <b:Author>
-        <b:NameList>
-          <b:Person>
-            <b:Last>michael</b:Last>
-          </b:Person>
-        </b:NameList>
-      </b:Author>
-    </b:Author>
-    <b:Title>michael-fuchs-sql</b:Title>
-    <b:Year>2021</b:Year>
-    <b:Month>marzo</b:Month>
-    <b:Day>03</b:Day>
-    <b:URL>https://michael-fuchs-sql.netlify.app/2021/03/03/entity-relationship-diagram-erd/</b:URL>
-    <b:RefOrder>7</b:RefOrder>
-  </b:Source>
-  <b:Source>
-    <b:Tag>Pet</b:Tag>
-    <b:SourceType>InternetSite</b:SourceType>
-    <b:Guid>{AA2B9042-8737-4DED-ACFE-229A347E0FB7}</b:Guid>
-    <b:Author>
-      <b:Author>
-        <b:NameList>
-          <b:Person>
-            <b:Last>Chen</b:Last>
-            <b:First>Peter</b:First>
-            <b:Middle>Pin Shan</b:Middle>
-          </b:Person>
-        </b:NameList>
-      </b:Author>
-    </b:Author>
-    <b:Title>acm.org</b:Title>
-    <b:URL>https://dl.acm.org/doi/10.1145/320434.320440</b:URL>
-    <b:RefOrder>8</b:RefOrder>
-  </b:Source>
-</b:Sources>
+<file path=customXml/item2.xml><?xml version="1.0" encoding="utf-8"?>
+<?mso-contentType ?>
+<FormTemplates xmlns="http://schemas.microsoft.com/sharepoint/v3/contenttype/forms">
+  <Display>DocumentLibraryForm</Display>
+  <Edit>DocumentLibraryForm</Edit>
+  <New>DocumentLibraryForm</New>
+</FormTemplates>
 </file>
 
-<file path=customXml/item4.xml><?xml version="1.0" encoding="utf-8"?>
-<p:properties xmlns:p="http://schemas.microsoft.com/office/2006/metadata/properties" xmlns:xsi="http://www.w3.org/2001/XMLSchema-instance" xmlns:pc="http://schemas.microsoft.com/office/infopath/2007/PartnerControls">
-  <documentManagement/>
-</p:properties>
-</file>
-
-<file path=customXml/item5.xml><?xml version="1.0" encoding="utf-8"?>
+<file path=customXml/item3.xml><?xml version="1.0" encoding="utf-8"?>
 <ct:contentTypeSchema xmlns:ct="http://schemas.microsoft.com/office/2006/metadata/contentType" xmlns:ma="http://schemas.microsoft.com/office/2006/metadata/properties/metaAttributes" ct:_="" ma:_="" ma:contentTypeName="Documento" ma:contentTypeID="0x01010032CE308956FE214DB8556B13F4B7C129" ma:contentTypeVersion="9" ma:contentTypeDescription="Crear nuevo documento." ma:contentTypeScope="" ma:versionID="abd25854170be142d6e279d32a47f41b">
   <xsd:schema xmlns:xsd="http://www.w3.org/2001/XMLSchema" xmlns:xs="http://www.w3.org/2001/XMLSchema" xmlns:p="http://schemas.microsoft.com/office/2006/metadata/properties" xmlns:ns3="43f8cd5b-775c-45a5-b556-d0332f058a22" targetNamespace="http://schemas.microsoft.com/office/2006/metadata/properties" ma:root="true" ma:fieldsID="869c6ea2e775afe6d93533091cd2b26a" ns3:_="">
     <xsd:import namespace="43f8cd5b-775c-45a5-b556-d0332f058a22"/>
@@ -36088,15 +34686,115 @@
 </ct:contentTypeSchema>
 </file>
 
-<file path=customXml/itemProps1.xml><?xml version="1.0" encoding="utf-8"?>
-<ds:datastoreItem xmlns:ds="http://schemas.openxmlformats.org/officeDocument/2006/customXml" ds:itemID="{32776731-9437-4459-9E81-37733192129C}">
-  <ds:schemaRefs>
-    <ds:schemaRef ds:uri="http://schemas.microsoft.com/sharepoint/v3/contenttype/forms"/>
-  </ds:schemaRefs>
-</ds:datastoreItem>
+<file path=customXml/item4.xml><?xml version="1.0" encoding="utf-8"?>
+<p:properties xmlns:p="http://schemas.microsoft.com/office/2006/metadata/properties" xmlns:xsi="http://www.w3.org/2001/XMLSchema-instance" xmlns:pc="http://schemas.microsoft.com/office/infopath/2007/PartnerControls">
+  <documentManagement/>
+</p:properties>
 </file>
 
-<file path=customXml/itemProps2.xml><?xml version="1.0" encoding="utf-8"?>
+<file path=customXml/item5.xml><?xml version="1.0" encoding="utf-8"?>
+<b:Sources xmlns:b="http://schemas.openxmlformats.org/officeDocument/2006/bibliography" xmlns="http://schemas.openxmlformats.org/officeDocument/2006/bibliography" SelectedStyle="\APASixthEditionOfficeOnline.xsl" StyleName="APA" Version="6">
+  <b:Source>
+    <b:Tag>Dib</b:Tag>
+    <b:SourceType>InternetSite</b:SourceType>
+    <b:Guid>{A129B543-C7F9-4057-BB8D-21C4F7CEC6FA}</b:Guid>
+    <b:Title>Dibujo conceptual</b:Title>
+    <b:URL>https://www.conceptdraw.com/How-To-Guide/idef1x</b:URL>
+    <b:RefOrder>3</b:RefOrder>
+  </b:Source>
+  <b:Source>
+    <b:Tag>Pro</b:Tag>
+    <b:SourceType>InternetSite</b:SourceType>
+    <b:Guid>{2FA4EB10-30FF-4220-B28C-0D930CEF2713}</b:Guid>
+    <b:LCID>es-CO</b:LCID>
+    <b:Title>Project Performance International</b:Title>
+    <b:URL>https://segoldmine.ppi-int.com/node/44269#:~:text=IDEF%20(Integration%20DEFinition)%20is%20a,Documents</b:URL>
+    <b:RefOrder>2</b:RefOrder>
+  </b:Source>
+  <b:Source>
+    <b:Tag>Ess</b:Tag>
+    <b:SourceType>InternetSite</b:SourceType>
+    <b:Guid>{3BA7A616-6D6B-4558-95A3-487095B8257F}</b:Guid>
+    <b:Title>Essential Strategies, Inc.</b:Title>
+    <b:URL>https://www.essentialstrategies.com/publications/modeling/idef1</b:URL>
+    <b:RefOrder>4</b:RefOrder>
+  </b:Source>
+  <b:Source>
+    <b:Tag>Wik25</b:Tag>
+    <b:SourceType>InternetSite</b:SourceType>
+    <b:Guid>{5E1780A9-018F-4E51-90C1-50DA52E1DDEB}</b:Guid>
+    <b:Title>Wikipedia The Free Encyclopedia</b:Title>
+    <b:Year>2025</b:Year>
+    <b:Month>Abril</b:Month>
+    <b:Day>27</b:Day>
+    <b:URL>https://en.wikipedia.org/wiki/IDEF1X?</b:URL>
+    <b:RefOrder>1</b:RefOrder>
+  </b:Source>
+  <b:Source>
+    <b:Tag>gee25</b:Tag>
+    <b:SourceType>InternetSite</b:SourceType>
+    <b:Guid>{DCF30AE4-8FD6-4B02-874A-3B8AF43FF14F}</b:Guid>
+    <b:Title>geeksforgeeks</b:Title>
+    <b:Year>2025</b:Year>
+    <b:Month>Julio</b:Month>
+    <b:Day>25</b:Day>
+    <b:URL>https://www.geeksforgeeks.org/dbms/structural-constraints-of-relationships-in-er-model/</b:URL>
+    <b:RefOrder>6</b:RefOrder>
+  </b:Source>
+  <b:Source>
+    <b:Tag>wik25</b:Tag>
+    <b:SourceType>InternetSite</b:SourceType>
+    <b:Guid>{58704EEB-315E-4DFB-A0B9-26B09DA18770}</b:Guid>
+    <b:Title>wikipedia</b:Title>
+    <b:Year>2025</b:Year>
+    <b:Month>febrero</b:Month>
+    <b:Day>21</b:Day>
+    <b:URL>https://de.wikipedia.org/wiki/Min-Max-Notation?</b:URL>
+    <b:RefOrder>5</b:RefOrder>
+  </b:Source>
+  <b:Source>
+    <b:Tag>mic21</b:Tag>
+    <b:SourceType>InternetSite</b:SourceType>
+    <b:Guid>{D70D8356-8FCF-477B-974C-35A7716BCC08}</b:Guid>
+    <b:Author>
+      <b:Author>
+        <b:NameList>
+          <b:Person>
+            <b:Last>michael</b:Last>
+          </b:Person>
+        </b:NameList>
+      </b:Author>
+    </b:Author>
+    <b:Title>michael-fuchs-sql</b:Title>
+    <b:Year>2021</b:Year>
+    <b:Month>marzo</b:Month>
+    <b:Day>03</b:Day>
+    <b:URL>https://michael-fuchs-sql.netlify.app/2021/03/03/entity-relationship-diagram-erd/</b:URL>
+    <b:RefOrder>7</b:RefOrder>
+  </b:Source>
+  <b:Source>
+    <b:Tag>Pet</b:Tag>
+    <b:SourceType>InternetSite</b:SourceType>
+    <b:Guid>{AA2B9042-8737-4DED-ACFE-229A347E0FB7}</b:Guid>
+    <b:Author>
+      <b:Author>
+        <b:NameList>
+          <b:Person>
+            <b:Last>Chen</b:Last>
+            <b:First>Peter</b:First>
+            <b:Middle>Pin Shan</b:Middle>
+          </b:Person>
+        </b:NameList>
+      </b:Author>
+    </b:Author>
+    <b:Title>acm.org</b:Title>
+    <b:URL>https://dl.acm.org/doi/10.1145/320434.320440</b:URL>
+    <b:RefOrder>8</b:RefOrder>
+  </b:Source>
+</b:Sources>
+</file>
+
+<file path=customXml/itemProps1.xml><?xml version="1.0" encoding="utf-8"?>
 <ds:datastoreItem xmlns:ds="http://schemas.openxmlformats.org/officeDocument/2006/customXml" ds:itemID="{7AD49E52-A027-4A0F-B49D-5D920DAE1EB3}">
   <ds:schemaRefs>
     <ds:schemaRef ds:uri="http://schemas.microsoft.com/office/2006/metadata/contentType"/>
@@ -36114,24 +34812,15 @@
 </ds:datastoreItem>
 </file>
 
-<file path=customXml/itemProps3.xml><?xml version="1.0" encoding="utf-8"?>
-<ds:datastoreItem xmlns:ds="http://schemas.openxmlformats.org/officeDocument/2006/customXml" ds:itemID="{17E10658-F6ED-401D-96FD-C1D9C908CB85}">
+<file path=customXml/itemProps2.xml><?xml version="1.0" encoding="utf-8"?>
+<ds:datastoreItem xmlns:ds="http://schemas.openxmlformats.org/officeDocument/2006/customXml" ds:itemID="{32776731-9437-4459-9E81-37733192129C}">
   <ds:schemaRefs>
-    <ds:schemaRef ds:uri="http://schemas.openxmlformats.org/officeDocument/2006/bibliography"/>
+    <ds:schemaRef ds:uri="http://schemas.microsoft.com/sharepoint/v3/contenttype/forms"/>
   </ds:schemaRefs>
 </ds:datastoreItem>
 </file>
 
-<file path=customXml/itemProps4.xml><?xml version="1.0" encoding="utf-8"?>
-<ds:datastoreItem xmlns:ds="http://schemas.openxmlformats.org/officeDocument/2006/customXml" ds:itemID="{E0C527AC-1E70-4B28-8303-9AABDD1A4218}">
-  <ds:schemaRefs>
-    <ds:schemaRef ds:uri="http://schemas.microsoft.com/office/2006/metadata/properties"/>
-    <ds:schemaRef ds:uri="http://schemas.microsoft.com/office/infopath/2007/PartnerControls"/>
-  </ds:schemaRefs>
-</ds:datastoreItem>
-</file>
-
-<file path=customXml/itemProps5.xml><?xml version="1.0" encoding="utf-8"?>
+<file path=customXml/itemProps3.xml><?xml version="1.0" encoding="utf-8"?>
 <ds:datastoreItem xmlns:ds="http://schemas.openxmlformats.org/officeDocument/2006/customXml" ds:itemID="{602BC9F0-B186-453F-A2E1-AE7197A57EE5}">
   <ds:schemaRefs>
     <ds:schemaRef ds:uri="http://schemas.microsoft.com/office/2006/metadata/contentType"/>
@@ -36147,4 +34836,21 @@
     <ds:schemaRef ds:uri="http://schemas.microsoft.com/internal/obd"/>
   </ds:schemaRefs>
 </ds:datastoreItem>
+</file>
+
+<file path=customXml/itemProps4.xml><?xml version="1.0" encoding="utf-8"?>
+<ds:datastoreItem xmlns:ds="http://schemas.openxmlformats.org/officeDocument/2006/customXml" ds:itemID="{E0C527AC-1E70-4B28-8303-9AABDD1A4218}">
+  <ds:schemaRefs>
+    <ds:schemaRef ds:uri="http://schemas.microsoft.com/office/2006/metadata/properties"/>
+    <ds:schemaRef ds:uri="http://schemas.microsoft.com/office/infopath/2007/PartnerControls"/>
+  </ds:schemaRefs>
+</ds:datastoreItem>
+</file>
+
+<file path=customXml/itemProps5.xml><?xml version="1.0" encoding="utf-8"?>
+<ds:datastoreItem xmlns:ds="http://schemas.openxmlformats.org/officeDocument/2006/customXml" ds:itemID="{17E10658-F6ED-401D-96FD-C1D9C908CB85}">
+  <ds:schemaRefs>
+    <ds:schemaRef ds:uri="http://schemas.openxmlformats.org/officeDocument/2006/bibliography"/>
+  </ds:schemaRefs>
+</ds:datastoreItem>
 </file>
</xml_diff>